<commit_message>
Báo cáo bản 5: chốt QD-12 (khoá AI trong app) và QD-13 (Claude, Mistral, Gemini)
Co-Authored-By: Claude Opus 5.5 <noreply@anthropic.com>
Claude-Session: https://claude.ai/code/session_011EgQiRUe1R4bJtKjm3y2V1
</commit_message>
<xml_diff>
--- a/bao-cao/BAO-CAO-RA-SOAT-LO-TRINH-GhiNhanh-20261013.docx
+++ b/bao-cao/BAO-CAO-RA-SOAT-LO-TRINH-GhiNhanh-20261013.docx
@@ -192,7 +192,7 @@
               <w:rPr>
                 <w:rFonts w:ascii="Arial" w:cs="Arial" w:eastAsia="Arial" w:hAnsi="Arial"/>
               </w:rPr>
-              <w:t xml:space="preserve">13/10/2026 (bản 4: chốt QD-10/11; thêm AI dự phòng – mục 12, kênh chuyển file – mục 13, rà soát khả dụng toàn bộ tính năng – mục 14; bản 3: thêm tối ưu tốc độ chụp/scan và chất lượng PDF ngang CamScanner – mục 11; bản 2: đăng nhập Google, mockup, layout, cây thư mục)</w:t>
+              <w:t xml:space="preserve">13/10/2026 (bản 5: chốt QD-12 khoá AI trong app, QD-13 Claude + Mistral – mục 12.5–12.6; bản 4: chốt QD-10/11; thêm AI dự phòng – mục 12, kênh chuyển file – mục 13, rà soát khả dụng toàn bộ tính năng – mục 14; bản 3: thêm tối ưu tốc độ chụp/scan và chất lượng PDF ngang CamScanner – mục 11; bản 2: đăng nhập Google, mockup, layout, cây thư mục)</w:t>
             </w:r>
           </w:p>
         </w:tc>
@@ -878,13 +878,173 @@
           <w:b/>
           <w:bCs/>
         </w:rPr>
-        <w:t xml:space="preserve">Đã chốt theo đề xuất:</w:t>
+        <w:t xml:space="preserve">Đã chốt:</w:t>
+      </w:r>
+    </w:p>
+    <w:p>
+      <w:pPr>
+        <w:pStyle w:val="ListParagraph"/>
+        <w:numPr>
+          <w:ilvl w:val="0"/>
+          <w:numId w:val="3"/>
+        </w:numPr>
+        <w:spacing w:after="60" w:line="276"/>
+      </w:pPr>
+      <w:r>
+        <w:rPr>
+          <w:rFonts w:ascii="Arial" w:cs="Arial" w:eastAsia="Arial" w:hAnsi="Arial"/>
+          <w:b/>
+          <w:bCs/>
+        </w:rPr>
+        <w:t xml:space="preserve">QD-10:</w:t>
       </w:r>
       <w:r>
         <w:rPr>
           <w:rFonts w:ascii="Arial" w:cs="Arial" w:eastAsia="Arial" w:hAnsi="Arial"/>
         </w:rPr>
-        <w:t xml:space="preserve"> QD-10 = Xuất 1 chạm dùng “Chuẩn – khớp ảnh”; QD-11 = làm PDF “HD nhẹ” (MRC) như tuỳ chọn, không mặc định, sau khi CS-20/CS-21 đạt.</w:t>
+        <w:t xml:space="preserve"> Xuất 1 chạm dùng hồ sơ “Chuẩn – khớp ảnh”.</w:t>
+      </w:r>
+    </w:p>
+    <w:p>
+      <w:pPr>
+        <w:pStyle w:val="ListParagraph"/>
+        <w:numPr>
+          <w:ilvl w:val="0"/>
+          <w:numId w:val="3"/>
+        </w:numPr>
+        <w:spacing w:after="60" w:line="276"/>
+      </w:pPr>
+      <w:r>
+        <w:rPr>
+          <w:rFonts w:ascii="Arial" w:cs="Arial" w:eastAsia="Arial" w:hAnsi="Arial"/>
+          <w:b/>
+          <w:bCs/>
+        </w:rPr>
+        <w:t xml:space="preserve">QD-11:</w:t>
+      </w:r>
+      <w:r>
+        <w:rPr>
+          <w:rFonts w:ascii="Arial" w:cs="Arial" w:eastAsia="Arial" w:hAnsi="Arial"/>
+        </w:rPr>
+        <w:t xml:space="preserve"> PDF “HD nhẹ” (MRC) là tuỳ chọn, không đặt mặc định, làm sau khi CS-20/CS-21 đạt.</w:t>
+      </w:r>
+    </w:p>
+    <w:p>
+      <w:pPr>
+        <w:pStyle w:val="ListParagraph"/>
+        <w:numPr>
+          <w:ilvl w:val="0"/>
+          <w:numId w:val="3"/>
+        </w:numPr>
+        <w:spacing w:after="60" w:line="276"/>
+      </w:pPr>
+      <w:r>
+        <w:rPr>
+          <w:rFonts w:ascii="Arial" w:cs="Arial" w:eastAsia="Arial" w:hAnsi="Arial"/>
+          <w:b/>
+          <w:bCs/>
+        </w:rPr>
+        <w:t xml:space="preserve">QD-12:</w:t>
+      </w:r>
+      <w:r>
+        <w:rPr>
+          <w:rFonts w:ascii="Arial" w:cs="Arial" w:eastAsia="Arial" w:hAnsi="Arial"/>
+        </w:rPr>
+        <w:t xml:space="preserve"> app chỉ một người dùng, nên </w:t>
+      </w:r>
+      <w:r>
+        <w:rPr>
+          <w:rFonts w:ascii="Arial" w:cs="Arial" w:eastAsia="Arial" w:hAnsi="Arial"/>
+          <w:b/>
+          <w:bCs/>
+        </w:rPr>
+        <w:t xml:space="preserve">cho phép nhập, đổi, xoá key AI ngay trong app</w:t>
+      </w:r>
+      <w:r>
+        <w:rPr>
+          <w:rFonts w:ascii="Arial" w:cs="Arial" w:eastAsia="Arial" w:hAnsi="Arial"/>
+        </w:rPr>
+        <w:t xml:space="preserve"> (Tôi → Khoá AI của tôi), lưu mã hoá trên máy (mục 12.5).</w:t>
+      </w:r>
+    </w:p>
+    <w:p>
+      <w:pPr>
+        <w:pStyle w:val="ListParagraph"/>
+        <w:numPr>
+          <w:ilvl w:val="0"/>
+          <w:numId w:val="3"/>
+        </w:numPr>
+        <w:spacing w:after="60" w:line="276"/>
+      </w:pPr>
+      <w:r>
+        <w:rPr>
+          <w:rFonts w:ascii="Arial" w:cs="Arial" w:eastAsia="Arial" w:hAnsi="Arial"/>
+          <w:b/>
+          <w:bCs/>
+        </w:rPr>
+        <w:t xml:space="preserve">QD-13:</w:t>
+      </w:r>
+      <w:r>
+        <w:rPr>
+          <w:rFonts w:ascii="Arial" w:cs="Arial" w:eastAsia="Arial" w:hAnsi="Arial"/>
+        </w:rPr>
+        <w:t xml:space="preserve"> thứ tự nguồn AI là Lovable → </w:t>
+      </w:r>
+      <w:r>
+        <w:rPr>
+          <w:rFonts w:ascii="Arial" w:cs="Arial" w:eastAsia="Arial" w:hAnsi="Arial"/>
+          <w:b/>
+          <w:bCs/>
+        </w:rPr>
+        <w:t xml:space="preserve">Claude</w:t>
+      </w:r>
+      <w:r>
+        <w:rPr>
+          <w:rFonts w:ascii="Arial" w:cs="Arial" w:eastAsia="Arial" w:hAnsi="Arial"/>
+        </w:rPr>
+        <w:t xml:space="preserve"> (key riêng) → </w:t>
+      </w:r>
+      <w:r>
+        <w:rPr>
+          <w:rFonts w:ascii="Arial" w:cs="Arial" w:eastAsia="Arial" w:hAnsi="Arial"/>
+          <w:b/>
+          <w:bCs/>
+        </w:rPr>
+        <w:t xml:space="preserve">Mistral</w:t>
+      </w:r>
+      <w:r>
+        <w:rPr>
+          <w:rFonts w:ascii="Arial" w:cs="Arial" w:eastAsia="Arial" w:hAnsi="Arial"/>
+        </w:rPr>
+        <w:t xml:space="preserve"> (gói miễn phí) → </w:t>
+      </w:r>
+      <w:r>
+        <w:rPr>
+          <w:rFonts w:ascii="Arial" w:cs="Arial" w:eastAsia="Arial" w:hAnsi="Arial"/>
+          <w:b/>
+          <w:bCs/>
+        </w:rPr>
+        <w:t xml:space="preserve">Gemini</w:t>
+      </w:r>
+      <w:r>
+        <w:rPr>
+          <w:rFonts w:ascii="Arial" w:cs="Arial" w:eastAsia="Arial" w:hAnsi="Arial"/>
+        </w:rPr>
+        <w:t xml:space="preserve"> (gói miễn phí, tôi đề xuất thêm) → xử lý trên máy. </w:t>
+      </w:r>
+      <w:r>
+        <w:rPr>
+          <w:rFonts w:ascii="Arial" w:cs="Arial" w:eastAsia="Arial" w:hAnsi="Arial"/>
+          <w:b/>
+          <w:bCs/>
+        </w:rPr>
+        <w:t xml:space="preserve">Lưu ý:</w:t>
+      </w:r>
+      <w:r>
+        <w:rPr>
+          <w:rFonts w:ascii="Arial" w:cs="Arial" w:eastAsia="Arial" w:hAnsi="Arial"/>
+        </w:rPr>
+        <w:t xml:space="preserve"> Claude API không có gói miễn phí, phải nạp tiền. Chọn Haiku 5.5 thì khoảng 15 đ/trang. Bật cơ chế tự chuyển mô hình khi bị từ chối để không bị chặn giữa chừng (mục 12.6).</w:t>
       </w:r>
     </w:p>
     <w:p>
@@ -931,7 +1091,7 @@
         <w:rPr>
           <w:rFonts w:ascii="Arial" w:cs="Arial" w:eastAsia="Arial" w:hAnsi="Arial"/>
         </w:rPr>
-        <w:t xml:space="preserve"> cho lỗi dữ liệu. Lộ trình gồm 8 đợt, 46 hạng mục (mục 15). Thứ tự nên làm: BL-00 (đăng nhập Google), BL-01 (sao lưu), AI-01 (AI dự phòng) và TF-01 (chia sẻ) → Đợt 1 CS-01…CS-05 (lõi chụp trước – xử lý sau, người dùng thấy ngay) → Đợt 2 màn hình theo lô → Đợt 3 mục Thêm hợp nhất → các đợt còn lại.</w:t>
+        <w:t xml:space="preserve"> cho lỗi dữ liệu. Lộ trình gồm 8 đợt, 48 hạng mục (mục 15). Thứ tự nên làm: BL-00 (đăng nhập Google), BL-01 (sao lưu), AI-01 (AI dự phòng) và TF-01 (chia sẻ) → Đợt 1 CS-01…CS-05 (lõi chụp trước – xử lý sau, người dùng thấy ngay) → Đợt 2 màn hình theo lô → Đợt 3 mục Thêm hợp nhất → các đợt còn lại.</w:t>
       </w:r>
     </w:p>
     <w:p>
@@ -7004,7 +7164,7 @@
         <w:pStyle w:val="ListParagraph"/>
         <w:numPr>
           <w:ilvl w:val="0"/>
-          <w:numId w:val="3"/>
+          <w:numId w:val="4"/>
         </w:numPr>
         <w:spacing w:after="60" w:line="276"/>
       </w:pPr>
@@ -7020,7 +7180,7 @@
         <w:pStyle w:val="ListParagraph"/>
         <w:numPr>
           <w:ilvl w:val="0"/>
-          <w:numId w:val="3"/>
+          <w:numId w:val="4"/>
         </w:numPr>
         <w:spacing w:after="60" w:line="276"/>
       </w:pPr>
@@ -7050,7 +7210,7 @@
         <w:pStyle w:val="ListParagraph"/>
         <w:numPr>
           <w:ilvl w:val="0"/>
-          <w:numId w:val="3"/>
+          <w:numId w:val="4"/>
         </w:numPr>
         <w:spacing w:after="60" w:line="276"/>
       </w:pPr>
@@ -7080,7 +7240,7 @@
         <w:pStyle w:val="ListParagraph"/>
         <w:numPr>
           <w:ilvl w:val="0"/>
-          <w:numId w:val="3"/>
+          <w:numId w:val="4"/>
         </w:numPr>
         <w:spacing w:after="60" w:line="276"/>
       </w:pPr>
@@ -8613,7 +8773,7 @@
         <w:pStyle w:val="ListParagraph"/>
         <w:numPr>
           <w:ilvl w:val="0"/>
-          <w:numId w:val="4"/>
+          <w:numId w:val="3"/>
         </w:numPr>
         <w:spacing w:after="60" w:line="276"/>
       </w:pPr>
@@ -8637,7 +8797,7 @@
         <w:pStyle w:val="ListParagraph"/>
         <w:numPr>
           <w:ilvl w:val="0"/>
-          <w:numId w:val="4"/>
+          <w:numId w:val="3"/>
         </w:numPr>
         <w:spacing w:after="60" w:line="276"/>
       </w:pPr>
@@ -8661,7 +8821,7 @@
         <w:pStyle w:val="ListParagraph"/>
         <w:numPr>
           <w:ilvl w:val="0"/>
-          <w:numId w:val="4"/>
+          <w:numId w:val="3"/>
         </w:numPr>
         <w:spacing w:after="60" w:line="276"/>
       </w:pPr>
@@ -8685,7 +8845,7 @@
         <w:pStyle w:val="ListParagraph"/>
         <w:numPr>
           <w:ilvl w:val="0"/>
-          <w:numId w:val="4"/>
+          <w:numId w:val="3"/>
         </w:numPr>
         <w:spacing w:after="60" w:line="276"/>
       </w:pPr>
@@ -8709,7 +8869,7 @@
         <w:pStyle w:val="ListParagraph"/>
         <w:numPr>
           <w:ilvl w:val="0"/>
-          <w:numId w:val="4"/>
+          <w:numId w:val="3"/>
         </w:numPr>
         <w:spacing w:after="60" w:line="276"/>
       </w:pPr>
@@ -9708,7 +9868,7 @@
         <w:pStyle w:val="ListParagraph"/>
         <w:numPr>
           <w:ilvl w:val="0"/>
-          <w:numId w:val="4"/>
+          <w:numId w:val="3"/>
         </w:numPr>
         <w:spacing w:after="60" w:line="276"/>
       </w:pPr>
@@ -9732,7 +9892,7 @@
         <w:pStyle w:val="ListParagraph"/>
         <w:numPr>
           <w:ilvl w:val="0"/>
-          <w:numId w:val="4"/>
+          <w:numId w:val="3"/>
         </w:numPr>
         <w:spacing w:after="60" w:line="276"/>
       </w:pPr>
@@ -9756,7 +9916,7 @@
         <w:pStyle w:val="ListParagraph"/>
         <w:numPr>
           <w:ilvl w:val="0"/>
-          <w:numId w:val="4"/>
+          <w:numId w:val="3"/>
         </w:numPr>
         <w:spacing w:after="60" w:line="276"/>
       </w:pPr>
@@ -9780,7 +9940,7 @@
         <w:pStyle w:val="ListParagraph"/>
         <w:numPr>
           <w:ilvl w:val="0"/>
-          <w:numId w:val="4"/>
+          <w:numId w:val="3"/>
         </w:numPr>
         <w:spacing w:after="60" w:line="276"/>
       </w:pPr>
@@ -9804,7 +9964,7 @@
         <w:pStyle w:val="ListParagraph"/>
         <w:numPr>
           <w:ilvl w:val="0"/>
-          <w:numId w:val="4"/>
+          <w:numId w:val="3"/>
         </w:numPr>
         <w:spacing w:after="60" w:line="276"/>
       </w:pPr>
@@ -9828,7 +9988,7 @@
         <w:pStyle w:val="ListParagraph"/>
         <w:numPr>
           <w:ilvl w:val="0"/>
-          <w:numId w:val="4"/>
+          <w:numId w:val="3"/>
         </w:numPr>
         <w:spacing w:after="60" w:line="276"/>
       </w:pPr>
@@ -12545,7 +12705,7 @@
         <w:pStyle w:val="ListParagraph"/>
         <w:numPr>
           <w:ilvl w:val="0"/>
-          <w:numId w:val="4"/>
+          <w:numId w:val="3"/>
         </w:numPr>
         <w:spacing w:after="60" w:line="276"/>
       </w:pPr>
@@ -12561,7 +12721,7 @@
         <w:pStyle w:val="ListParagraph"/>
         <w:numPr>
           <w:ilvl w:val="0"/>
-          <w:numId w:val="4"/>
+          <w:numId w:val="3"/>
         </w:numPr>
         <w:spacing w:after="60" w:line="276"/>
       </w:pPr>
@@ -12577,7 +12737,7 @@
         <w:pStyle w:val="ListParagraph"/>
         <w:numPr>
           <w:ilvl w:val="0"/>
-          <w:numId w:val="4"/>
+          <w:numId w:val="3"/>
         </w:numPr>
         <w:spacing w:after="60" w:line="276"/>
       </w:pPr>
@@ -13449,7 +13609,25 @@
           <w:sz w:val="14"/>
           <w:szCs w:val="14"/>
         </w:rPr>
-        <w:t xml:space="preserve">│   ├── ai-providers.ts          MỚI  chuỗi AI dự phòng Lovable → Gemini → Claude/OpenAI (AI-01)</w:t>
+        <w:t xml:space="preserve">│   ├── ai-providers.ts          MỚI  chuỗi AI Lovable → Claude → Mistral → Gemini (AI-01, AI-05)</w:t>
+      </w:r>
+    </w:p>
+    <w:p>
+      <w:pPr>
+        <w:shd w:fill="F3F6F5" w:color="auto" w:val="clear"/>
+        <w:spacing w:after="0" w:line="240"/>
+        <w:ind w:left="120"/>
+      </w:pPr>
+      <w:r>
+        <w:rPr>
+          <w:rFonts w:ascii="Consolas" w:cs="Consolas" w:eastAsia="Consolas" w:hAnsi="Consolas"/>
+          <w:b/>
+          <w:bCs/>
+          <w:color w:val="0F7A66"/>
+          <w:sz w:val="14"/>
+          <w:szCs w:val="14"/>
+        </w:rPr>
+        <w:t xml:space="preserve">│   ├── ai-keys.ts               MỚI  khoá AI của bạn, mã hoá trên máy (AI-04)</w:t>
       </w:r>
     </w:p>
     <w:p>
@@ -18383,7 +18561,7 @@
         <w:pStyle w:val="ListParagraph"/>
         <w:numPr>
           <w:ilvl w:val="0"/>
-          <w:numId w:val="4"/>
+          <w:numId w:val="3"/>
         </w:numPr>
         <w:spacing w:after="60" w:line="276"/>
       </w:pPr>
@@ -18441,7 +18619,7 @@
         <w:pStyle w:val="ListParagraph"/>
         <w:numPr>
           <w:ilvl w:val="0"/>
-          <w:numId w:val="4"/>
+          <w:numId w:val="3"/>
         </w:numPr>
         <w:spacing w:after="60" w:line="276"/>
       </w:pPr>
@@ -18485,7 +18663,7 @@
         <w:pStyle w:val="ListParagraph"/>
         <w:numPr>
           <w:ilvl w:val="0"/>
-          <w:numId w:val="4"/>
+          <w:numId w:val="3"/>
         </w:numPr>
         <w:spacing w:after="60" w:line="276"/>
       </w:pPr>
@@ -20449,7 +20627,7 @@
               <w:rPr>
                 <w:rFonts w:ascii="Arial" w:cs="Arial" w:eastAsia="Arial" w:hAnsi="Arial"/>
               </w:rPr>
-              <w:t xml:space="preserve">Anthropic (Claude)</w:t>
+              <w:t xml:space="preserve">Anthropic (Claude) – ĐÃ CHỌN (QD-13)</w:t>
             </w:r>
           </w:p>
         </w:tc>
@@ -20477,7 +20655,7 @@
               <w:rPr>
                 <w:rFonts w:ascii="Arial" w:cs="Arial" w:eastAsia="Arial" w:hAnsi="Arial"/>
               </w:rPr>
-              <w:t xml:space="preserve">claude-opus-5-5 (mặc định, chính xác nhất); claude-sonnet-5-5 hoặc claude-haiku-5-5 nếu muốn rẻ hơn</w:t>
+              <w:t xml:space="preserve">claude-opus-5-5 (mặc định, chính xác nhất); claude-sonnet-5-5; claude-haiku-5-5 (rẻ nhất)</w:t>
             </w:r>
           </w:p>
         </w:tc>
@@ -20505,7 +20683,7 @@
               <w:rPr>
                 <w:rFonts w:ascii="Arial" w:cs="Arial" w:eastAsia="Arial" w:hAnsi="Arial"/>
               </w:rPr>
-              <w:t xml:space="preserve">Trả phí theo token</w:t>
+              <w:t xml:space="preserve">Không có gói API miễn phí; trả trước (nạp credit), đặt hạn mức chi tiêu tháng trong Console</w:t>
             </w:r>
           </w:p>
         </w:tc>
@@ -21017,7 +21195,7 @@
               <w:rPr>
                 <w:rFonts w:ascii="Arial" w:cs="Arial" w:eastAsia="Arial" w:hAnsi="Arial"/>
               </w:rPr>
-              <w:t xml:space="preserve">Groq, Mistral</w:t>
+              <w:t xml:space="preserve">Mistral – ĐÃ CHỌN (QD-13)</w:t>
             </w:r>
           </w:p>
         </w:tc>
@@ -21045,7 +21223,7 @@
               <w:rPr>
                 <w:rFonts w:ascii="Arial" w:cs="Arial" w:eastAsia="Arial" w:hAnsi="Arial"/>
               </w:rPr>
-              <w:t xml:space="preserve">Tuỳ danh mục hiện hành (Mistral có mô hình OCR riêng)</w:t>
+              <w:t xml:space="preserve">Mô hình có đọc ảnh (dòng Mistral Medium/Pixtral); Mistral OCR cho đọc chữ/bảng tài liệu (kiểm gói)</w:t>
             </w:r>
           </w:p>
         </w:tc>
@@ -21073,6 +21251,148 @@
               <w:rPr>
                 <w:rFonts w:ascii="Arial" w:cs="Arial" w:eastAsia="Arial" w:hAnsi="Arial"/>
               </w:rPr>
+              <w:t xml:space="preserve">Gói Experiment miễn phí, giới hạn tốc độ; cần xác minh số điện thoại; dữ liệu có thể dùng để huấn luyện</w:t>
+            </w:r>
+          </w:p>
+        </w:tc>
+        <w:tc>
+          <w:tcPr>
+            <w:tcW w:type="dxa" w:w="2120"/>
+            <w:tcBorders>
+              <w:top w:val="single" w:color="BFC7C5" w:sz="4"/>
+              <w:left w:val="single" w:color="BFC7C5" w:sz="4"/>
+              <w:bottom w:val="single" w:color="BFC7C5" w:sz="4"/>
+              <w:right w:val="single" w:color="BFC7C5" w:sz="4"/>
+            </w:tcBorders>
+            <w:tcMar>
+              <w:top w:type="dxa" w:w="60"/>
+              <w:left w:type="dxa" w:w="100"/>
+              <w:bottom w:type="dxa" w:w="60"/>
+              <w:right w:type="dxa" w:w="100"/>
+            </w:tcMar>
+          </w:tcPr>
+          <w:p>
+            <w:pPr>
+              <w:spacing w:after="20"/>
+            </w:pPr>
+            <w:r>
+              <w:rPr>
+                <w:rFonts w:ascii="Arial" w:cs="Arial" w:eastAsia="Arial" w:hAnsi="Arial"/>
+              </w:rPr>
+              <w:t xml:space="preserve">https://console.mistral.ai/api-keys</w:t>
+            </w:r>
+          </w:p>
+        </w:tc>
+        <w:tc>
+          <w:tcPr>
+            <w:tcW w:type="dxa" w:w="1350"/>
+            <w:tcBorders>
+              <w:top w:val="single" w:color="BFC7C5" w:sz="4"/>
+              <w:left w:val="single" w:color="BFC7C5" w:sz="4"/>
+              <w:bottom w:val="single" w:color="BFC7C5" w:sz="4"/>
+              <w:right w:val="single" w:color="BFC7C5" w:sz="4"/>
+            </w:tcBorders>
+            <w:tcMar>
+              <w:top w:type="dxa" w:w="60"/>
+              <w:left w:type="dxa" w:w="100"/>
+              <w:bottom w:type="dxa" w:w="60"/>
+              <w:right w:type="dxa" w:w="100"/>
+            </w:tcMar>
+          </w:tcPr>
+          <w:p>
+            <w:pPr>
+              <w:spacing w:after="20"/>
+            </w:pPr>
+            <w:r>
+              <w:rPr>
+                <w:rFonts w:ascii="Arial" w:cs="Arial" w:eastAsia="Arial" w:hAnsi="Arial"/>
+              </w:rPr>
+              <w:t xml:space="preserve">MISTRAL_API_KEY</w:t>
+            </w:r>
+          </w:p>
+        </w:tc>
+      </w:tr>
+      <w:tr>
+        <w:tc>
+          <w:tcPr>
+            <w:tcW w:type="dxa" w:w="1638"/>
+            <w:tcBorders>
+              <w:top w:val="single" w:color="BFC7C5" w:sz="4"/>
+              <w:left w:val="single" w:color="BFC7C5" w:sz="4"/>
+              <w:bottom w:val="single" w:color="BFC7C5" w:sz="4"/>
+              <w:right w:val="single" w:color="BFC7C5" w:sz="4"/>
+            </w:tcBorders>
+            <w:tcMar>
+              <w:top w:type="dxa" w:w="60"/>
+              <w:left w:type="dxa" w:w="100"/>
+              <w:bottom w:type="dxa" w:w="60"/>
+              <w:right w:type="dxa" w:w="100"/>
+            </w:tcMar>
+          </w:tcPr>
+          <w:p>
+            <w:pPr>
+              <w:spacing w:after="20"/>
+            </w:pPr>
+            <w:r>
+              <w:rPr>
+                <w:rFonts w:ascii="Arial" w:cs="Arial" w:eastAsia="Arial" w:hAnsi="Arial"/>
+              </w:rPr>
+              <w:t xml:space="preserve">Groq</w:t>
+            </w:r>
+          </w:p>
+        </w:tc>
+        <w:tc>
+          <w:tcPr>
+            <w:tcW w:type="dxa" w:w="2602"/>
+            <w:tcBorders>
+              <w:top w:val="single" w:color="BFC7C5" w:sz="4"/>
+              <w:left w:val="single" w:color="BFC7C5" w:sz="4"/>
+              <w:bottom w:val="single" w:color="BFC7C5" w:sz="4"/>
+              <w:right w:val="single" w:color="BFC7C5" w:sz="4"/>
+            </w:tcBorders>
+            <w:tcMar>
+              <w:top w:type="dxa" w:w="60"/>
+              <w:left w:type="dxa" w:w="100"/>
+              <w:bottom w:type="dxa" w:w="60"/>
+              <w:right w:type="dxa" w:w="100"/>
+            </w:tcMar>
+          </w:tcPr>
+          <w:p>
+            <w:pPr>
+              <w:spacing w:after="20"/>
+            </w:pPr>
+            <w:r>
+              <w:rPr>
+                <w:rFonts w:ascii="Arial" w:cs="Arial" w:eastAsia="Arial" w:hAnsi="Arial"/>
+              </w:rPr>
+              <w:t xml:space="preserve">Tuỳ danh mục hiện hành</w:t>
+            </w:r>
+          </w:p>
+        </w:tc>
+        <w:tc>
+          <w:tcPr>
+            <w:tcW w:type="dxa" w:w="1928"/>
+            <w:tcBorders>
+              <w:top w:val="single" w:color="BFC7C5" w:sz="4"/>
+              <w:left w:val="single" w:color="BFC7C5" w:sz="4"/>
+              <w:bottom w:val="single" w:color="BFC7C5" w:sz="4"/>
+              <w:right w:val="single" w:color="BFC7C5" w:sz="4"/>
+            </w:tcBorders>
+            <w:tcMar>
+              <w:top w:type="dxa" w:w="60"/>
+              <w:left w:type="dxa" w:w="100"/>
+              <w:bottom w:type="dxa" w:w="60"/>
+              <w:right w:type="dxa" w:w="100"/>
+            </w:tcMar>
+          </w:tcPr>
+          <w:p>
+            <w:pPr>
+              <w:spacing w:after="20"/>
+            </w:pPr>
+            <w:r>
+              <w:rPr>
+                <w:rFonts w:ascii="Arial" w:cs="Arial" w:eastAsia="Arial" w:hAnsi="Arial"/>
+              </w:rPr>
               <w:t xml:space="preserve">Cần kiểm</w:t>
             </w:r>
           </w:p>
@@ -21101,7 +21421,7 @@
               <w:rPr>
                 <w:rFonts w:ascii="Arial" w:cs="Arial" w:eastAsia="Arial" w:hAnsi="Arial"/>
               </w:rPr>
-              <w:t xml:space="preserve">https://console.groq.com/keys · https://console.mistral.ai/api-keys</w:t>
+              <w:t xml:space="preserve">https://console.groq.com/keys</w:t>
             </w:r>
           </w:p>
         </w:tc>
@@ -21129,7 +21449,7 @@
               <w:rPr>
                 <w:rFonts w:ascii="Arial" w:cs="Arial" w:eastAsia="Arial" w:hAnsi="Arial"/>
               </w:rPr>
-              <w:t xml:space="preserve">GROQ_API_KEY · MISTRAL_API_KEY</w:t>
+              <w:t xml:space="preserve">GROQ_API_KEY</w:t>
             </w:r>
           </w:p>
         </w:tc>
@@ -21150,13 +21470,13 @@
           <w:b/>
           <w:bCs/>
         </w:rPr>
-        <w:t xml:space="preserve">Khuyến nghị:</w:t>
+        <w:t xml:space="preserve">Thứ tự đã chốt (QD-13):</w:t>
       </w:r>
       <w:r>
         <w:rPr>
           <w:rFonts w:ascii="Arial" w:cs="Arial" w:eastAsia="Arial" w:hAnsi="Arial"/>
         </w:rPr>
-        <w:t xml:space="preserve"> ① Gemini (rẻ, có miễn phí, đọc ảnh tiếng Việt tốt) làm dự phòng thứ nhất. ② Claude làm dự phòng chất lượng cao cho đọc bảng và trích xuất; khi viết mã dùng SDK chính thức @anthropic-ai/sdk. ③ OpenRouter miễn phí chỉ để thử, không dùng cho người dùng thật. ④ Luôn còn đường “không AI” trên máy.</w:t>
+        <w:t xml:space="preserve"> ① Lovable khi còn credit → ② Claude bằng key của bạn (chất lượng cao, dùng được cho giấy tờ nhạy cảm; viết mã bằng SDK chính thức @anthropic-ai/sdk) → ③ Mistral miễn phí → ④ Gemini miễn phí (tôi đề xuất thêm vì đọc ảnh tiếng Việt tốt và có hạn mức miễn phí) → ⑤ xử lý trên máy. OpenRouter chỉ để thử. Thứ tự đổi được trong app.</w:t>
       </w:r>
     </w:p>
     <w:p>
@@ -21169,9 +21489,9 @@
       <w:r>
         <w:drawing>
           <wp:inline distT="0" distB="0" distL="0" distR="0">
-            <wp:extent cx="6096000" cy="962025"/>
+            <wp:extent cx="6096000" cy="1047750"/>
             <wp:effectExtent t="0" r="0" b="0" l="0"/>
-            <wp:docPr id="1" name="f13.png" descr="Chuỗi AI dự phòng đề xuất: Lovable → Gemini → nhà cung cấp trả phí → xử lý trên máy" title="Chuỗi AI dự phòng đề xuất: Lovable → Gemini → nhà cung cấp trả phí → xử lý trên máy"/>
+            <wp:docPr id="1" name="f13.png" descr="Chuỗi AI đã chốt: Lovable → Claude (key riêng) → Mistral → Gemini → xử lý trên máy; giấy tờ nhạy cảm không gửi tới nguồn miễn phí" title="Chuỗi AI đã chốt: Lovable → Claude (key riêng) → Mistral → Gemini → xử lý trên máy; giấy tờ nhạy cảm không gửi tới nguồn miễn phí"/>
             <wp:cNvGraphicFramePr>
               <a:graphicFrameLocks xmlns:a="http://schemas.openxmlformats.org/drawingml/2006/main" noChangeAspect="1"/>
             </wp:cNvGraphicFramePr>
@@ -21194,7 +21514,7 @@
                   <pic:spPr bwMode="auto">
                     <a:xfrm>
                       <a:off x="0" y="0"/>
-                      <a:ext cx="6096000" cy="962025"/>
+                      <a:ext cx="6096000" cy="1047750"/>
                     </a:xfrm>
                     <a:prstGeom prst="rect">
                       <a:avLst/>
@@ -21221,7 +21541,7 @@
           <w:sz w:val="18"/>
           <w:szCs w:val="18"/>
         </w:rPr>
-        <w:t xml:space="preserve">Hình 12 – Chuỗi AI dự phòng đề xuất: Lovable → Gemini → nhà cung cấp trả phí → xử lý trên máy</w:t>
+        <w:t xml:space="preserve">Hình 12 – Chuỗi AI đã chốt: Lovable → Claude (key riêng) → Mistral → Gemini → xử lý trên máy; giấy tờ nhạy cảm không gửi tới nguồn miễn phí</w:t>
       </w:r>
     </w:p>
     <w:p>
@@ -21232,7 +21552,7 @@
         <w:rPr>
           <w:rFonts w:ascii="Arial" w:cs="Arial" w:eastAsia="Arial" w:hAnsi="Arial"/>
         </w:rPr>
-        <w:t xml:space="preserve">12.3 Cách lấy và đặt key (ví dụ Gemini)</w:t>
+        <w:t xml:space="preserve">12.3 Cách lấy và đặt key (ví dụ Gemini – các nhà cung cấp khác tương tự)</w:t>
       </w:r>
     </w:p>
     <w:p>
@@ -21280,7 +21600,7 @@
         <w:rPr>
           <w:rFonts w:ascii="Arial" w:cs="Arial" w:eastAsia="Arial" w:hAnsi="Arial"/>
         </w:rPr>
-        <w:t xml:space="preserve">Đặt AI_PROVIDERS=lovable,gemini (thứ tự thử). Không bao giờ đặt key với tiền tố VITE_, vì tiền tố này đưa key xuống trình duyệt cho mọi người xem.</w:t>
+        <w:t xml:space="preserve">Cách khác (theo QD-12, khuyến nghị cho bạn): dán key thẳng vào app ở Tôi → Khoá AI của tôi; không cần vào Lovable. Nếu đặt ở máy chủ thì dùng AI_PROVIDERS=lovable,claude,mistral,gemini và tuyệt đối không dùng tiền tố VITE_.</w:t>
       </w:r>
     </w:p>
     <w:p>
@@ -21307,7 +21627,1804 @@
         <w:rPr>
           <w:rFonts w:ascii="Arial" w:cs="Arial" w:eastAsia="Arial" w:hAnsi="Arial"/>
         </w:rPr>
-        <w:t xml:space="preserve">12.4 Hạng mục AI</w:t>
+        <w:t xml:space="preserve">12.4 Lấy key Claude và Mistral</w:t>
+      </w:r>
+    </w:p>
+    <w:tbl>
+      <w:tblPr>
+        <w:tblW w:type="dxa" w:w="9638"/>
+        <w:tblBorders>
+          <w:top w:val="single" w:color="auto" w:sz="4"/>
+          <w:left w:val="single" w:color="auto" w:sz="4"/>
+          <w:bottom w:val="single" w:color="auto" w:sz="4"/>
+          <w:right w:val="single" w:color="auto" w:sz="4"/>
+          <w:insideH w:val="single" w:color="auto" w:sz="4"/>
+          <w:insideV w:val="single" w:color="auto" w:sz="4"/>
+        </w:tblBorders>
+      </w:tblPr>
+      <w:tblGrid>
+        <w:gridCol w:w="1735"/>
+        <w:gridCol w:w="4241"/>
+        <w:gridCol w:w="3662"/>
+      </w:tblGrid>
+      <w:tr>
+        <w:trPr>
+          <w:tblHeader/>
+        </w:trPr>
+        <w:tc>
+          <w:tcPr>
+            <w:tcW w:type="dxa" w:w="1735"/>
+            <w:tcBorders>
+              <w:top w:val="single" w:color="BFC7C5" w:sz="4"/>
+              <w:left w:val="single" w:color="BFC7C5" w:sz="4"/>
+              <w:bottom w:val="single" w:color="BFC7C5" w:sz="4"/>
+              <w:right w:val="single" w:color="BFC7C5" w:sz="4"/>
+            </w:tcBorders>
+            <w:shd w:fill="006F59" w:color="auto" w:val="clear"/>
+            <w:tcMar>
+              <w:top w:type="dxa" w:w="60"/>
+              <w:left w:type="dxa" w:w="100"/>
+              <w:bottom w:type="dxa" w:w="60"/>
+              <w:right w:type="dxa" w:w="100"/>
+            </w:tcMar>
+          </w:tcPr>
+          <w:p>
+            <w:pPr>
+              <w:spacing w:after="20"/>
+            </w:pPr>
+            <w:r>
+              <w:rPr>
+                <w:rFonts w:ascii="Arial" w:cs="Arial" w:eastAsia="Arial" w:hAnsi="Arial"/>
+                <w:b/>
+                <w:bCs/>
+                <w:color w:val="FFFFFF"/>
+                <w:sz w:val="19"/>
+                <w:szCs w:val="19"/>
+              </w:rPr>
+              <w:t xml:space="preserve">Bước</w:t>
+            </w:r>
+          </w:p>
+        </w:tc>
+        <w:tc>
+          <w:tcPr>
+            <w:tcW w:type="dxa" w:w="4241"/>
+            <w:tcBorders>
+              <w:top w:val="single" w:color="BFC7C5" w:sz="4"/>
+              <w:left w:val="single" w:color="BFC7C5" w:sz="4"/>
+              <w:bottom w:val="single" w:color="BFC7C5" w:sz="4"/>
+              <w:right w:val="single" w:color="BFC7C5" w:sz="4"/>
+            </w:tcBorders>
+            <w:shd w:fill="006F59" w:color="auto" w:val="clear"/>
+            <w:tcMar>
+              <w:top w:type="dxa" w:w="60"/>
+              <w:left w:type="dxa" w:w="100"/>
+              <w:bottom w:type="dxa" w:w="60"/>
+              <w:right w:type="dxa" w:w="100"/>
+            </w:tcMar>
+          </w:tcPr>
+          <w:p>
+            <w:pPr>
+              <w:spacing w:after="20"/>
+            </w:pPr>
+            <w:r>
+              <w:rPr>
+                <w:rFonts w:ascii="Arial" w:cs="Arial" w:eastAsia="Arial" w:hAnsi="Arial"/>
+                <w:b/>
+                <w:bCs/>
+                <w:color w:val="FFFFFF"/>
+                <w:sz w:val="19"/>
+                <w:szCs w:val="19"/>
+              </w:rPr>
+              <w:t xml:space="preserve">Claude (Anthropic)</w:t>
+            </w:r>
+          </w:p>
+        </w:tc>
+        <w:tc>
+          <w:tcPr>
+            <w:tcW w:type="dxa" w:w="3662"/>
+            <w:tcBorders>
+              <w:top w:val="single" w:color="BFC7C5" w:sz="4"/>
+              <w:left w:val="single" w:color="BFC7C5" w:sz="4"/>
+              <w:bottom w:val="single" w:color="BFC7C5" w:sz="4"/>
+              <w:right w:val="single" w:color="BFC7C5" w:sz="4"/>
+            </w:tcBorders>
+            <w:shd w:fill="006F59" w:color="auto" w:val="clear"/>
+            <w:tcMar>
+              <w:top w:type="dxa" w:w="60"/>
+              <w:left w:type="dxa" w:w="100"/>
+              <w:bottom w:type="dxa" w:w="60"/>
+              <w:right w:type="dxa" w:w="100"/>
+            </w:tcMar>
+          </w:tcPr>
+          <w:p>
+            <w:pPr>
+              <w:spacing w:after="20"/>
+            </w:pPr>
+            <w:r>
+              <w:rPr>
+                <w:rFonts w:ascii="Arial" w:cs="Arial" w:eastAsia="Arial" w:hAnsi="Arial"/>
+                <w:b/>
+                <w:bCs/>
+                <w:color w:val="FFFFFF"/>
+                <w:sz w:val="19"/>
+                <w:szCs w:val="19"/>
+              </w:rPr>
+              <w:t xml:space="preserve">Mistral</w:t>
+            </w:r>
+          </w:p>
+        </w:tc>
+      </w:tr>
+      <w:tr>
+        <w:tc>
+          <w:tcPr>
+            <w:tcW w:type="dxa" w:w="1735"/>
+            <w:tcBorders>
+              <w:top w:val="single" w:color="BFC7C5" w:sz="4"/>
+              <w:left w:val="single" w:color="BFC7C5" w:sz="4"/>
+              <w:bottom w:val="single" w:color="BFC7C5" w:sz="4"/>
+              <w:right w:val="single" w:color="BFC7C5" w:sz="4"/>
+            </w:tcBorders>
+            <w:tcMar>
+              <w:top w:type="dxa" w:w="60"/>
+              <w:left w:type="dxa" w:w="100"/>
+              <w:bottom w:type="dxa" w:w="60"/>
+              <w:right w:type="dxa" w:w="100"/>
+            </w:tcMar>
+          </w:tcPr>
+          <w:p>
+            <w:pPr>
+              <w:spacing w:after="20"/>
+            </w:pPr>
+            <w:r>
+              <w:rPr>
+                <w:rFonts w:ascii="Arial" w:cs="Arial" w:eastAsia="Arial" w:hAnsi="Arial"/>
+              </w:rPr>
+              <w:t xml:space="preserve">1. Tạo tài khoản</w:t>
+            </w:r>
+          </w:p>
+        </w:tc>
+        <w:tc>
+          <w:tcPr>
+            <w:tcW w:type="dxa" w:w="4241"/>
+            <w:tcBorders>
+              <w:top w:val="single" w:color="BFC7C5" w:sz="4"/>
+              <w:left w:val="single" w:color="BFC7C5" w:sz="4"/>
+              <w:bottom w:val="single" w:color="BFC7C5" w:sz="4"/>
+              <w:right w:val="single" w:color="BFC7C5" w:sz="4"/>
+            </w:tcBorders>
+            <w:tcMar>
+              <w:top w:type="dxa" w:w="60"/>
+              <w:left w:type="dxa" w:w="100"/>
+              <w:bottom w:type="dxa" w:w="60"/>
+              <w:right w:type="dxa" w:w="100"/>
+            </w:tcMar>
+          </w:tcPr>
+          <w:p>
+            <w:pPr>
+              <w:spacing w:after="20"/>
+            </w:pPr>
+            <w:r>
+              <w:rPr>
+                <w:rFonts w:ascii="Arial" w:cs="Arial" w:eastAsia="Arial" w:hAnsi="Arial"/>
+              </w:rPr>
+              <w:t xml:space="preserve">https://console.anthropic.com (email/Google)</w:t>
+            </w:r>
+          </w:p>
+        </w:tc>
+        <w:tc>
+          <w:tcPr>
+            <w:tcW w:type="dxa" w:w="3662"/>
+            <w:tcBorders>
+              <w:top w:val="single" w:color="BFC7C5" w:sz="4"/>
+              <w:left w:val="single" w:color="BFC7C5" w:sz="4"/>
+              <w:bottom w:val="single" w:color="BFC7C5" w:sz="4"/>
+              <w:right w:val="single" w:color="BFC7C5" w:sz="4"/>
+            </w:tcBorders>
+            <w:tcMar>
+              <w:top w:type="dxa" w:w="60"/>
+              <w:left w:type="dxa" w:w="100"/>
+              <w:bottom w:type="dxa" w:w="60"/>
+              <w:right w:type="dxa" w:w="100"/>
+            </w:tcMar>
+          </w:tcPr>
+          <w:p>
+            <w:pPr>
+              <w:spacing w:after="20"/>
+            </w:pPr>
+            <w:r>
+              <w:rPr>
+                <w:rFonts w:ascii="Arial" w:cs="Arial" w:eastAsia="Arial" w:hAnsi="Arial"/>
+              </w:rPr>
+              <w:t xml:space="preserve">https://console.mistral.ai (xác minh số điện thoại)</w:t>
+            </w:r>
+          </w:p>
+        </w:tc>
+      </w:tr>
+      <w:tr>
+        <w:tc>
+          <w:tcPr>
+            <w:tcW w:type="dxa" w:w="1735"/>
+            <w:tcBorders>
+              <w:top w:val="single" w:color="BFC7C5" w:sz="4"/>
+              <w:left w:val="single" w:color="BFC7C5" w:sz="4"/>
+              <w:bottom w:val="single" w:color="BFC7C5" w:sz="4"/>
+              <w:right w:val="single" w:color="BFC7C5" w:sz="4"/>
+            </w:tcBorders>
+            <w:tcMar>
+              <w:top w:type="dxa" w:w="60"/>
+              <w:left w:type="dxa" w:w="100"/>
+              <w:bottom w:type="dxa" w:w="60"/>
+              <w:right w:type="dxa" w:w="100"/>
+            </w:tcMar>
+          </w:tcPr>
+          <w:p>
+            <w:pPr>
+              <w:spacing w:after="20"/>
+            </w:pPr>
+            <w:r>
+              <w:rPr>
+                <w:rFonts w:ascii="Arial" w:cs="Arial" w:eastAsia="Arial" w:hAnsi="Arial"/>
+              </w:rPr>
+              <w:t xml:space="preserve">2. Kích hoạt</w:t>
+            </w:r>
+          </w:p>
+        </w:tc>
+        <w:tc>
+          <w:tcPr>
+            <w:tcW w:type="dxa" w:w="4241"/>
+            <w:tcBorders>
+              <w:top w:val="single" w:color="BFC7C5" w:sz="4"/>
+              <w:left w:val="single" w:color="BFC7C5" w:sz="4"/>
+              <w:bottom w:val="single" w:color="BFC7C5" w:sz="4"/>
+              <w:right w:val="single" w:color="BFC7C5" w:sz="4"/>
+            </w:tcBorders>
+            <w:tcMar>
+              <w:top w:type="dxa" w:w="60"/>
+              <w:left w:type="dxa" w:w="100"/>
+              <w:bottom w:type="dxa" w:w="60"/>
+              <w:right w:type="dxa" w:w="100"/>
+            </w:tcMar>
+          </w:tcPr>
+          <w:p>
+            <w:pPr>
+              <w:spacing w:after="20"/>
+            </w:pPr>
+            <w:r>
+              <w:rPr>
+                <w:rFonts w:ascii="Arial" w:cs="Arial" w:eastAsia="Arial" w:hAnsi="Arial"/>
+              </w:rPr>
+              <w:t xml:space="preserve">Billing → nạp credit (thẻ quốc tế). Kiểm Việt Nam có trong danh sách hỗ trợ: https://www.anthropic.com/supported-countries</w:t>
+            </w:r>
+          </w:p>
+        </w:tc>
+        <w:tc>
+          <w:tcPr>
+            <w:tcW w:type="dxa" w:w="3662"/>
+            <w:tcBorders>
+              <w:top w:val="single" w:color="BFC7C5" w:sz="4"/>
+              <w:left w:val="single" w:color="BFC7C5" w:sz="4"/>
+              <w:bottom w:val="single" w:color="BFC7C5" w:sz="4"/>
+              <w:right w:val="single" w:color="BFC7C5" w:sz="4"/>
+            </w:tcBorders>
+            <w:tcMar>
+              <w:top w:type="dxa" w:w="60"/>
+              <w:left w:type="dxa" w:w="100"/>
+              <w:bottom w:type="dxa" w:w="60"/>
+              <w:right w:type="dxa" w:w="100"/>
+            </w:tcMar>
+          </w:tcPr>
+          <w:p>
+            <w:pPr>
+              <w:spacing w:after="20"/>
+            </w:pPr>
+            <w:r>
+              <w:rPr>
+                <w:rFonts w:ascii="Arial" w:cs="Arial" w:eastAsia="Arial" w:hAnsi="Arial"/>
+              </w:rPr>
+              <w:t xml:space="preserve">Chọn gói Experiment (miễn phí) hoặc thêm thẻ để lên gói trả theo dùng</w:t>
+            </w:r>
+          </w:p>
+        </w:tc>
+      </w:tr>
+      <w:tr>
+        <w:tc>
+          <w:tcPr>
+            <w:tcW w:type="dxa" w:w="1735"/>
+            <w:tcBorders>
+              <w:top w:val="single" w:color="BFC7C5" w:sz="4"/>
+              <w:left w:val="single" w:color="BFC7C5" w:sz="4"/>
+              <w:bottom w:val="single" w:color="BFC7C5" w:sz="4"/>
+              <w:right w:val="single" w:color="BFC7C5" w:sz="4"/>
+            </w:tcBorders>
+            <w:tcMar>
+              <w:top w:type="dxa" w:w="60"/>
+              <w:left w:type="dxa" w:w="100"/>
+              <w:bottom w:type="dxa" w:w="60"/>
+              <w:right w:type="dxa" w:w="100"/>
+            </w:tcMar>
+          </w:tcPr>
+          <w:p>
+            <w:pPr>
+              <w:spacing w:after="20"/>
+            </w:pPr>
+            <w:r>
+              <w:rPr>
+                <w:rFonts w:ascii="Arial" w:cs="Arial" w:eastAsia="Arial" w:hAnsi="Arial"/>
+              </w:rPr>
+              <w:t xml:space="preserve">3. Tạo key</w:t>
+            </w:r>
+          </w:p>
+        </w:tc>
+        <w:tc>
+          <w:tcPr>
+            <w:tcW w:type="dxa" w:w="4241"/>
+            <w:tcBorders>
+              <w:top w:val="single" w:color="BFC7C5" w:sz="4"/>
+              <w:left w:val="single" w:color="BFC7C5" w:sz="4"/>
+              <w:bottom w:val="single" w:color="BFC7C5" w:sz="4"/>
+              <w:right w:val="single" w:color="BFC7C5" w:sz="4"/>
+            </w:tcBorders>
+            <w:tcMar>
+              <w:top w:type="dxa" w:w="60"/>
+              <w:left w:type="dxa" w:w="100"/>
+              <w:bottom w:type="dxa" w:w="60"/>
+              <w:right w:type="dxa" w:w="100"/>
+            </w:tcMar>
+          </w:tcPr>
+          <w:p>
+            <w:pPr>
+              <w:spacing w:after="20"/>
+            </w:pPr>
+            <w:r>
+              <w:rPr>
+                <w:rFonts w:ascii="Arial" w:cs="Arial" w:eastAsia="Arial" w:hAnsi="Arial"/>
+              </w:rPr>
+              <w:t xml:space="preserve">Settings → API keys → Create key (dạng sk-ant-…)</w:t>
+            </w:r>
+          </w:p>
+        </w:tc>
+        <w:tc>
+          <w:tcPr>
+            <w:tcW w:type="dxa" w:w="3662"/>
+            <w:tcBorders>
+              <w:top w:val="single" w:color="BFC7C5" w:sz="4"/>
+              <w:left w:val="single" w:color="BFC7C5" w:sz="4"/>
+              <w:bottom w:val="single" w:color="BFC7C5" w:sz="4"/>
+              <w:right w:val="single" w:color="BFC7C5" w:sz="4"/>
+            </w:tcBorders>
+            <w:tcMar>
+              <w:top w:type="dxa" w:w="60"/>
+              <w:left w:type="dxa" w:w="100"/>
+              <w:bottom w:type="dxa" w:w="60"/>
+              <w:right w:type="dxa" w:w="100"/>
+            </w:tcMar>
+          </w:tcPr>
+          <w:p>
+            <w:pPr>
+              <w:spacing w:after="20"/>
+            </w:pPr>
+            <w:r>
+              <w:rPr>
+                <w:rFonts w:ascii="Arial" w:cs="Arial" w:eastAsia="Arial" w:hAnsi="Arial"/>
+              </w:rPr>
+              <w:t xml:space="preserve">API keys → Create new key</w:t>
+            </w:r>
+          </w:p>
+        </w:tc>
+      </w:tr>
+      <w:tr>
+        <w:tc>
+          <w:tcPr>
+            <w:tcW w:type="dxa" w:w="1735"/>
+            <w:tcBorders>
+              <w:top w:val="single" w:color="BFC7C5" w:sz="4"/>
+              <w:left w:val="single" w:color="BFC7C5" w:sz="4"/>
+              <w:bottom w:val="single" w:color="BFC7C5" w:sz="4"/>
+              <w:right w:val="single" w:color="BFC7C5" w:sz="4"/>
+            </w:tcBorders>
+            <w:tcMar>
+              <w:top w:type="dxa" w:w="60"/>
+              <w:left w:type="dxa" w:w="100"/>
+              <w:bottom w:type="dxa" w:w="60"/>
+              <w:right w:type="dxa" w:w="100"/>
+            </w:tcMar>
+          </w:tcPr>
+          <w:p>
+            <w:pPr>
+              <w:spacing w:after="20"/>
+            </w:pPr>
+            <w:r>
+              <w:rPr>
+                <w:rFonts w:ascii="Arial" w:cs="Arial" w:eastAsia="Arial" w:hAnsi="Arial"/>
+              </w:rPr>
+              <w:t xml:space="preserve">4. Đặt hạn mức</w:t>
+            </w:r>
+          </w:p>
+        </w:tc>
+        <w:tc>
+          <w:tcPr>
+            <w:tcW w:type="dxa" w:w="4241"/>
+            <w:tcBorders>
+              <w:top w:val="single" w:color="BFC7C5" w:sz="4"/>
+              <w:left w:val="single" w:color="BFC7C5" w:sz="4"/>
+              <w:bottom w:val="single" w:color="BFC7C5" w:sz="4"/>
+              <w:right w:val="single" w:color="BFC7C5" w:sz="4"/>
+            </w:tcBorders>
+            <w:tcMar>
+              <w:top w:type="dxa" w:w="60"/>
+              <w:left w:type="dxa" w:w="100"/>
+              <w:bottom w:type="dxa" w:w="60"/>
+              <w:right w:type="dxa" w:w="100"/>
+            </w:tcMar>
+          </w:tcPr>
+          <w:p>
+            <w:pPr>
+              <w:spacing w:after="20"/>
+            </w:pPr>
+            <w:r>
+              <w:rPr>
+                <w:rFonts w:ascii="Arial" w:cs="Arial" w:eastAsia="Arial" w:hAnsi="Arial"/>
+              </w:rPr>
+              <w:t xml:space="preserve">Limits → đặt hạn mức chi tiêu tháng (ví dụ 5 USD) để không bị trừ tiền ngoài ý muốn</w:t>
+            </w:r>
+          </w:p>
+        </w:tc>
+        <w:tc>
+          <w:tcPr>
+            <w:tcW w:type="dxa" w:w="3662"/>
+            <w:tcBorders>
+              <w:top w:val="single" w:color="BFC7C5" w:sz="4"/>
+              <w:left w:val="single" w:color="BFC7C5" w:sz="4"/>
+              <w:bottom w:val="single" w:color="BFC7C5" w:sz="4"/>
+              <w:right w:val="single" w:color="BFC7C5" w:sz="4"/>
+            </w:tcBorders>
+            <w:tcMar>
+              <w:top w:type="dxa" w:w="60"/>
+              <w:left w:type="dxa" w:w="100"/>
+              <w:bottom w:type="dxa" w:w="60"/>
+              <w:right w:type="dxa" w:w="100"/>
+            </w:tcMar>
+          </w:tcPr>
+          <w:p>
+            <w:pPr>
+              <w:spacing w:after="20"/>
+            </w:pPr>
+            <w:r>
+              <w:rPr>
+                <w:rFonts w:ascii="Arial" w:cs="Arial" w:eastAsia="Arial" w:hAnsi="Arial"/>
+              </w:rPr>
+              <w:t xml:space="preserve">Xem Limits trong Admin Console</w:t>
+            </w:r>
+          </w:p>
+        </w:tc>
+      </w:tr>
+      <w:tr>
+        <w:tc>
+          <w:tcPr>
+            <w:tcW w:type="dxa" w:w="1735"/>
+            <w:tcBorders>
+              <w:top w:val="single" w:color="BFC7C5" w:sz="4"/>
+              <w:left w:val="single" w:color="BFC7C5" w:sz="4"/>
+              <w:bottom w:val="single" w:color="BFC7C5" w:sz="4"/>
+              <w:right w:val="single" w:color="BFC7C5" w:sz="4"/>
+            </w:tcBorders>
+            <w:tcMar>
+              <w:top w:type="dxa" w:w="60"/>
+              <w:left w:type="dxa" w:w="100"/>
+              <w:bottom w:type="dxa" w:w="60"/>
+              <w:right w:type="dxa" w:w="100"/>
+            </w:tcMar>
+          </w:tcPr>
+          <w:p>
+            <w:pPr>
+              <w:spacing w:after="20"/>
+            </w:pPr>
+            <w:r>
+              <w:rPr>
+                <w:rFonts w:ascii="Arial" w:cs="Arial" w:eastAsia="Arial" w:hAnsi="Arial"/>
+              </w:rPr>
+              <w:t xml:space="preserve">5. Dán vào app</w:t>
+            </w:r>
+          </w:p>
+        </w:tc>
+        <w:tc>
+          <w:tcPr>
+            <w:tcW w:type="dxa" w:w="4241"/>
+            <w:tcBorders>
+              <w:top w:val="single" w:color="BFC7C5" w:sz="4"/>
+              <w:left w:val="single" w:color="BFC7C5" w:sz="4"/>
+              <w:bottom w:val="single" w:color="BFC7C5" w:sz="4"/>
+              <w:right w:val="single" w:color="BFC7C5" w:sz="4"/>
+            </w:tcBorders>
+            <w:tcMar>
+              <w:top w:type="dxa" w:w="60"/>
+              <w:left w:type="dxa" w:w="100"/>
+              <w:bottom w:type="dxa" w:w="60"/>
+              <w:right w:type="dxa" w:w="100"/>
+            </w:tcMar>
+          </w:tcPr>
+          <w:p>
+            <w:pPr>
+              <w:spacing w:after="20"/>
+            </w:pPr>
+            <w:r>
+              <w:rPr>
+                <w:rFonts w:ascii="Arial" w:cs="Arial" w:eastAsia="Arial" w:hAnsi="Arial"/>
+              </w:rPr>
+              <w:t xml:space="preserve">Tôi → Khoá AI của tôi → Claude → dán → Kiểm tra</w:t>
+            </w:r>
+          </w:p>
+        </w:tc>
+        <w:tc>
+          <w:tcPr>
+            <w:tcW w:type="dxa" w:w="3662"/>
+            <w:tcBorders>
+              <w:top w:val="single" w:color="BFC7C5" w:sz="4"/>
+              <w:left w:val="single" w:color="BFC7C5" w:sz="4"/>
+              <w:bottom w:val="single" w:color="BFC7C5" w:sz="4"/>
+              <w:right w:val="single" w:color="BFC7C5" w:sz="4"/>
+            </w:tcBorders>
+            <w:tcMar>
+              <w:top w:type="dxa" w:w="60"/>
+              <w:left w:type="dxa" w:w="100"/>
+              <w:bottom w:type="dxa" w:w="60"/>
+              <w:right w:type="dxa" w:w="100"/>
+            </w:tcMar>
+          </w:tcPr>
+          <w:p>
+            <w:pPr>
+              <w:spacing w:after="20"/>
+            </w:pPr>
+            <w:r>
+              <w:rPr>
+                <w:rFonts w:ascii="Arial" w:cs="Arial" w:eastAsia="Arial" w:hAnsi="Arial"/>
+              </w:rPr>
+              <w:t xml:space="preserve">Tôi → Khoá AI của tôi → Mistral → dán → Kiểm tra</w:t>
+            </w:r>
+          </w:p>
+        </w:tc>
+      </w:tr>
+    </w:tbl>
+    <w:p>
+      <w:pPr>
+        <w:pStyle w:val="Heading2"/>
+      </w:pPr>
+      <w:r>
+        <w:rPr>
+          <w:rFonts w:ascii="Arial" w:cs="Arial" w:eastAsia="Arial" w:hAnsi="Arial"/>
+        </w:rPr>
+        <w:t xml:space="preserve">12.5 Khoá AI trong app (QD-12)</w:t>
+      </w:r>
+    </w:p>
+    <w:p>
+      <w:pPr>
+        <w:keepNext/>
+        <w:keepLines/>
+        <w:spacing w:after="60" w:before="120"/>
+        <w:jc w:val="center"/>
+      </w:pPr>
+      <w:r>
+        <w:drawing>
+          <wp:inline distT="0" distB="0" distL="0" distR="0">
+            <wp:extent cx="6096000" cy="4800600"/>
+            <wp:effectExtent t="0" r="0" b="0" l="0"/>
+            <wp:docPr id="1" name="f14.png" descr="Màn “Khoá AI của tôi”: nhập/đổi/xoá key, chọn mô hình, đổi thứ tự, kiểm tra" title="Màn “Khoá AI của tôi”: nhập/đổi/xoá key, chọn mô hình, đổi thứ tự, kiểm tra"/>
+            <wp:cNvGraphicFramePr>
+              <a:graphicFrameLocks xmlns:a="http://schemas.openxmlformats.org/drawingml/2006/main" noChangeAspect="1"/>
+            </wp:cNvGraphicFramePr>
+            <a:graphic xmlns:a="http://schemas.openxmlformats.org/drawingml/2006/main">
+              <a:graphicData uri="http://schemas.openxmlformats.org/drawingml/2006/picture">
+                <pic:pic xmlns:pic="http://schemas.openxmlformats.org/drawingml/2006/picture">
+                  <pic:nvPicPr>
+                    <pic:cNvPr id="0" name="" descr=""/>
+                    <pic:cNvPicPr>
+                      <a:picLocks noChangeAspect="1" noChangeArrowheads="1"/>
+                    </pic:cNvPicPr>
+                  </pic:nvPicPr>
+                  <pic:blipFill>
+                    <a:blip r:embed="rId20" cstate="none"/>
+                    <a:srcRect/>
+                    <a:stretch>
+                      <a:fillRect/>
+                    </a:stretch>
+                  </pic:blipFill>
+                  <pic:spPr bwMode="auto">
+                    <a:xfrm>
+                      <a:off x="0" y="0"/>
+                      <a:ext cx="6096000" cy="4800600"/>
+                    </a:xfrm>
+                    <a:prstGeom prst="rect">
+                      <a:avLst/>
+                    </a:prstGeom>
+                  </pic:spPr>
+                </pic:pic>
+              </a:graphicData>
+            </a:graphic>
+          </wp:inline>
+        </w:drawing>
+      </w:r>
+    </w:p>
+    <w:p>
+      <w:pPr>
+        <w:spacing w:after="200"/>
+        <w:jc w:val="center"/>
+      </w:pPr>
+      <w:r>
+        <w:rPr>
+          <w:rFonts w:ascii="Arial" w:cs="Arial" w:eastAsia="Arial" w:hAnsi="Arial"/>
+          <w:i/>
+          <w:iCs/>
+          <w:color w:val="44544F"/>
+          <w:sz w:val="18"/>
+          <w:szCs w:val="18"/>
+        </w:rPr>
+        <w:t xml:space="preserve">Hình 13 – Màn “Khoá AI của tôi”: nhập/đổi/xoá key, chọn mô hình, đổi thứ tự, kiểm tra</w:t>
+      </w:r>
+    </w:p>
+    <w:p>
+      <w:pPr>
+        <w:pStyle w:val="ListParagraph"/>
+        <w:numPr>
+          <w:ilvl w:val="0"/>
+          <w:numId w:val="3"/>
+        </w:numPr>
+        <w:spacing w:after="60" w:line="276"/>
+      </w:pPr>
+      <w:r>
+        <w:rPr>
+          <w:rFonts w:ascii="Arial" w:cs="Arial" w:eastAsia="Arial" w:hAnsi="Arial"/>
+          <w:b/>
+          <w:bCs/>
+        </w:rPr>
+        <w:t xml:space="preserve">Lưu trữ:</w:t>
+      </w:r>
+      <w:r>
+        <w:rPr>
+          <w:rFonts w:ascii="Arial" w:cs="Arial" w:eastAsia="Arial" w:hAnsi="Arial"/>
+        </w:rPr>
+        <w:t xml:space="preserve"> key mã hoá AES-GCM bằng khoá thiết bị (WebCrypto, đánh dấu không xuất được, lưu trong IndexedDB); bật khoá PIN thì key nằm trong két PIN có sẵn. Không đưa vào sao lưu, đồng bộ mây, nhật ký lỗi, URL.</w:t>
+      </w:r>
+    </w:p>
+    <w:p>
+      <w:pPr>
+        <w:pStyle w:val="ListParagraph"/>
+        <w:numPr>
+          <w:ilvl w:val="0"/>
+          <w:numId w:val="3"/>
+        </w:numPr>
+        <w:spacing w:after="60" w:line="276"/>
+      </w:pPr>
+      <w:r>
+        <w:rPr>
+          <w:rFonts w:ascii="Arial" w:cs="Arial" w:eastAsia="Arial" w:hAnsi="Arial"/>
+          <w:b/>
+          <w:bCs/>
+        </w:rPr>
+        <w:t xml:space="preserve">Cách gọi – 2 chế độ:</w:t>
+      </w:r>
+      <w:r>
+        <w:rPr>
+          <w:rFonts w:ascii="Arial" w:cs="Arial" w:eastAsia="Arial" w:hAnsi="Arial"/>
+        </w:rPr>
+        <w:t xml:space="preserve"> (a) </w:t>
+      </w:r>
+      <w:r>
+        <w:rPr>
+          <w:rFonts w:ascii="Arial" w:cs="Arial" w:eastAsia="Arial" w:hAnsi="Arial"/>
+          <w:b/>
+          <w:bCs/>
+        </w:rPr>
+        <w:t xml:space="preserve">Gọi thẳng từ máy</w:t>
+      </w:r>
+      <w:r>
+        <w:rPr>
+          <w:rFonts w:ascii="Arial" w:cs="Arial" w:eastAsia="Arial" w:hAnsi="Arial"/>
+        </w:rPr>
+        <w:t xml:space="preserve"> (mặc định cho bạn): trình duyệt gọi thẳng API nhà cung cấp, không qua máy chủ Lovable, nên vẫn chạy khi Lovable hết credit hoặc máy chủ lỗi. Claude cho phép gọi từ trình duyệt bằng header anthropic-dangerous-direct-browser-access; Gemini hỗ trợ; Mistral cần kiểm CORS. (b) </w:t>
+      </w:r>
+      <w:r>
+        <w:rPr>
+          <w:rFonts w:ascii="Arial" w:cs="Arial" w:eastAsia="Arial" w:hAnsi="Arial"/>
+          <w:b/>
+          <w:bCs/>
+        </w:rPr>
+        <w:t xml:space="preserve">Qua máy chủ app:</w:t>
+      </w:r>
+      <w:r>
+        <w:rPr>
+          <w:rFonts w:ascii="Arial" w:cs="Arial" w:eastAsia="Arial" w:hAnsi="Arial"/>
+        </w:rPr>
+        <w:t xml:space="preserve"> key gửi kèm từng lệnh qua HTTPS, máy chủ dùng xong bỏ, không lưu, không ghi log.</w:t>
+      </w:r>
+    </w:p>
+    <w:p>
+      <w:pPr>
+        <w:pStyle w:val="ListParagraph"/>
+        <w:numPr>
+          <w:ilvl w:val="0"/>
+          <w:numId w:val="3"/>
+        </w:numPr>
+        <w:spacing w:after="60" w:line="276"/>
+      </w:pPr>
+      <w:r>
+        <w:rPr>
+          <w:rFonts w:ascii="Arial" w:cs="Arial" w:eastAsia="Arial" w:hAnsi="Arial"/>
+          <w:b/>
+          <w:bCs/>
+        </w:rPr>
+        <w:t xml:space="preserve">Giới hạn 60 lượt/giờ/IP</w:t>
+      </w:r>
+      <w:r>
+        <w:rPr>
+          <w:rFonts w:ascii="Arial" w:cs="Arial" w:eastAsia="Arial" w:hAnsi="Arial"/>
+        </w:rPr>
+        <w:t xml:space="preserve"> chỉ áp cho nguồn Lovable (tiền của chủ app); nguồn dùng key riêng không bị giới hạn này.</w:t>
+      </w:r>
+    </w:p>
+    <w:p>
+      <w:pPr>
+        <w:pStyle w:val="ListParagraph"/>
+        <w:numPr>
+          <w:ilvl w:val="0"/>
+          <w:numId w:val="3"/>
+        </w:numPr>
+        <w:spacing w:after="60" w:line="276"/>
+      </w:pPr>
+      <w:r>
+        <w:rPr>
+          <w:rFonts w:ascii="Arial" w:cs="Arial" w:eastAsia="Arial" w:hAnsi="Arial"/>
+          <w:b/>
+          <w:bCs/>
+        </w:rPr>
+        <w:t xml:space="preserve">Kiểm tra key:</w:t>
+      </w:r>
+      <w:r>
+        <w:rPr>
+          <w:rFonts w:ascii="Arial" w:cs="Arial" w:eastAsia="Arial" w:hAnsi="Arial"/>
+        </w:rPr>
+        <w:t xml:space="preserve"> gọi thử 1 lệnh rất nhỏ → Sẵn sàng / Sai key / Hết hạn mức / Bị chặn vùng / Hết credit; hiển thị chi phí ước tính theo mô hình đã chọn.</w:t>
+      </w:r>
+    </w:p>
+    <w:p>
+      <w:pPr>
+        <w:pStyle w:val="ListParagraph"/>
+        <w:numPr>
+          <w:ilvl w:val="0"/>
+          <w:numId w:val="3"/>
+        </w:numPr>
+        <w:spacing w:after="60" w:line="276"/>
+      </w:pPr>
+      <w:r>
+        <w:rPr>
+          <w:rFonts w:ascii="Arial" w:cs="Arial" w:eastAsia="Arial" w:hAnsi="Arial"/>
+          <w:b/>
+          <w:bCs/>
+        </w:rPr>
+        <w:t xml:space="preserve">Rủi ro và cách giảm:</w:t>
+      </w:r>
+      <w:r>
+        <w:rPr>
+          <w:rFonts w:ascii="Arial" w:cs="Arial" w:eastAsia="Arial" w:hAnsi="Arial"/>
+        </w:rPr>
+        <w:t xml:space="preserve"> ai cầm máy mở được app thì dùng được key, nên bật khoá PIN; đặt hạn mức chi tiêu tháng trên trang nhà cung cấp; có nút “Xoá mọi key” và nhắc thu hồi key trên trang nhà cung cấp khi mất máy.</w:t>
+      </w:r>
+    </w:p>
+    <w:p>
+      <w:pPr>
+        <w:pStyle w:val="Heading2"/>
+      </w:pPr>
+      <w:r>
+        <w:rPr>
+          <w:rFonts w:ascii="Arial" w:cs="Arial" w:eastAsia="Arial" w:hAnsi="Arial"/>
+        </w:rPr>
+        <w:t xml:space="preserve">12.6 Định tuyến, chi phí và “không bị chặn” (QD-13)</w:t>
+      </w:r>
+    </w:p>
+    <w:tbl>
+      <w:tblPr>
+        <w:tblW w:type="dxa" w:w="9638"/>
+        <w:tblBorders>
+          <w:top w:val="single" w:color="auto" w:sz="4"/>
+          <w:left w:val="single" w:color="auto" w:sz="4"/>
+          <w:bottom w:val="single" w:color="auto" w:sz="4"/>
+          <w:right w:val="single" w:color="auto" w:sz="4"/>
+          <w:insideH w:val="single" w:color="auto" w:sz="4"/>
+          <w:insideV w:val="single" w:color="auto" w:sz="4"/>
+        </w:tblBorders>
+      </w:tblPr>
+      <w:tblGrid>
+        <w:gridCol w:w="3084"/>
+        <w:gridCol w:w="3662"/>
+        <w:gridCol w:w="2892"/>
+      </w:tblGrid>
+      <w:tr>
+        <w:trPr>
+          <w:tblHeader/>
+        </w:trPr>
+        <w:tc>
+          <w:tcPr>
+            <w:tcW w:type="dxa" w:w="3084"/>
+            <w:tcBorders>
+              <w:top w:val="single" w:color="BFC7C5" w:sz="4"/>
+              <w:left w:val="single" w:color="BFC7C5" w:sz="4"/>
+              <w:bottom w:val="single" w:color="BFC7C5" w:sz="4"/>
+              <w:right w:val="single" w:color="BFC7C5" w:sz="4"/>
+            </w:tcBorders>
+            <w:shd w:fill="006F59" w:color="auto" w:val="clear"/>
+            <w:tcMar>
+              <w:top w:type="dxa" w:w="60"/>
+              <w:left w:type="dxa" w:w="100"/>
+              <w:bottom w:type="dxa" w:w="60"/>
+              <w:right w:type="dxa" w:w="100"/>
+            </w:tcMar>
+          </w:tcPr>
+          <w:p>
+            <w:pPr>
+              <w:spacing w:after="20"/>
+            </w:pPr>
+            <w:r>
+              <w:rPr>
+                <w:rFonts w:ascii="Arial" w:cs="Arial" w:eastAsia="Arial" w:hAnsi="Arial"/>
+                <w:b/>
+                <w:bCs/>
+                <w:color w:val="FFFFFF"/>
+                <w:sz w:val="19"/>
+                <w:szCs w:val="19"/>
+              </w:rPr>
+              <w:t xml:space="preserve">Loại tài liệu (sensitive.ts + doc-type)</w:t>
+            </w:r>
+          </w:p>
+        </w:tc>
+        <w:tc>
+          <w:tcPr>
+            <w:tcW w:type="dxa" w:w="3662"/>
+            <w:tcBorders>
+              <w:top w:val="single" w:color="BFC7C5" w:sz="4"/>
+              <w:left w:val="single" w:color="BFC7C5" w:sz="4"/>
+              <w:bottom w:val="single" w:color="BFC7C5" w:sz="4"/>
+              <w:right w:val="single" w:color="BFC7C5" w:sz="4"/>
+            </w:tcBorders>
+            <w:shd w:fill="006F59" w:color="auto" w:val="clear"/>
+            <w:tcMar>
+              <w:top w:type="dxa" w:w="60"/>
+              <w:left w:type="dxa" w:w="100"/>
+              <w:bottom w:type="dxa" w:w="60"/>
+              <w:right w:type="dxa" w:w="100"/>
+            </w:tcMar>
+          </w:tcPr>
+          <w:p>
+            <w:pPr>
+              <w:spacing w:after="20"/>
+            </w:pPr>
+            <w:r>
+              <w:rPr>
+                <w:rFonts w:ascii="Arial" w:cs="Arial" w:eastAsia="Arial" w:hAnsi="Arial"/>
+                <w:b/>
+                <w:bCs/>
+                <w:color w:val="FFFFFF"/>
+                <w:sz w:val="19"/>
+                <w:szCs w:val="19"/>
+              </w:rPr>
+              <w:t xml:space="preserve">Nguồn được dùng theo thứ tự</w:t>
+            </w:r>
+          </w:p>
+        </w:tc>
+        <w:tc>
+          <w:tcPr>
+            <w:tcW w:type="dxa" w:w="2892"/>
+            <w:tcBorders>
+              <w:top w:val="single" w:color="BFC7C5" w:sz="4"/>
+              <w:left w:val="single" w:color="BFC7C5" w:sz="4"/>
+              <w:bottom w:val="single" w:color="BFC7C5" w:sz="4"/>
+              <w:right w:val="single" w:color="BFC7C5" w:sz="4"/>
+            </w:tcBorders>
+            <w:shd w:fill="006F59" w:color="auto" w:val="clear"/>
+            <w:tcMar>
+              <w:top w:type="dxa" w:w="60"/>
+              <w:left w:type="dxa" w:w="100"/>
+              <w:bottom w:type="dxa" w:w="60"/>
+              <w:right w:type="dxa" w:w="100"/>
+            </w:tcMar>
+          </w:tcPr>
+          <w:p>
+            <w:pPr>
+              <w:spacing w:after="20"/>
+            </w:pPr>
+            <w:r>
+              <w:rPr>
+                <w:rFonts w:ascii="Arial" w:cs="Arial" w:eastAsia="Arial" w:hAnsi="Arial"/>
+                <w:b/>
+                <w:bCs/>
+                <w:color w:val="FFFFFF"/>
+                <w:sz w:val="19"/>
+                <w:szCs w:val="19"/>
+              </w:rPr>
+              <w:t xml:space="preserve">Lý do</w:t>
+            </w:r>
+          </w:p>
+        </w:tc>
+      </w:tr>
+      <w:tr>
+        <w:tc>
+          <w:tcPr>
+            <w:tcW w:type="dxa" w:w="3084"/>
+            <w:tcBorders>
+              <w:top w:val="single" w:color="BFC7C5" w:sz="4"/>
+              <w:left w:val="single" w:color="BFC7C5" w:sz="4"/>
+              <w:bottom w:val="single" w:color="BFC7C5" w:sz="4"/>
+              <w:right w:val="single" w:color="BFC7C5" w:sz="4"/>
+            </w:tcBorders>
+            <w:tcMar>
+              <w:top w:type="dxa" w:w="60"/>
+              <w:left w:type="dxa" w:w="100"/>
+              <w:bottom w:type="dxa" w:w="60"/>
+              <w:right w:type="dxa" w:w="100"/>
+            </w:tcMar>
+          </w:tcPr>
+          <w:p>
+            <w:pPr>
+              <w:spacing w:after="20"/>
+            </w:pPr>
+            <w:r>
+              <w:rPr>
+                <w:rFonts w:ascii="Arial" w:cs="Arial" w:eastAsia="Arial" w:hAnsi="Arial"/>
+              </w:rPr>
+              <w:t xml:space="preserve">Giấy tờ nhạy cảm: CCCD, hộ chiếu, sổ đỏ, sao kê, hợp đồng</w:t>
+            </w:r>
+          </w:p>
+        </w:tc>
+        <w:tc>
+          <w:tcPr>
+            <w:tcW w:type="dxa" w:w="3662"/>
+            <w:tcBorders>
+              <w:top w:val="single" w:color="BFC7C5" w:sz="4"/>
+              <w:left w:val="single" w:color="BFC7C5" w:sz="4"/>
+              <w:bottom w:val="single" w:color="BFC7C5" w:sz="4"/>
+              <w:right w:val="single" w:color="BFC7C5" w:sz="4"/>
+            </w:tcBorders>
+            <w:tcMar>
+              <w:top w:type="dxa" w:w="60"/>
+              <w:left w:type="dxa" w:w="100"/>
+              <w:bottom w:type="dxa" w:w="60"/>
+              <w:right w:type="dxa" w:w="100"/>
+            </w:tcMar>
+          </w:tcPr>
+          <w:p>
+            <w:pPr>
+              <w:spacing w:after="20"/>
+            </w:pPr>
+            <w:r>
+              <w:rPr>
+                <w:rFonts w:ascii="Arial" w:cs="Arial" w:eastAsia="Arial" w:hAnsi="Arial"/>
+              </w:rPr>
+              <w:t xml:space="preserve">Lovable → Claude → trên máy</w:t>
+            </w:r>
+          </w:p>
+        </w:tc>
+        <w:tc>
+          <w:tcPr>
+            <w:tcW w:type="dxa" w:w="2892"/>
+            <w:tcBorders>
+              <w:top w:val="single" w:color="BFC7C5" w:sz="4"/>
+              <w:left w:val="single" w:color="BFC7C5" w:sz="4"/>
+              <w:bottom w:val="single" w:color="BFC7C5" w:sz="4"/>
+              <w:right w:val="single" w:color="BFC7C5" w:sz="4"/>
+            </w:tcBorders>
+            <w:tcMar>
+              <w:top w:type="dxa" w:w="60"/>
+              <w:left w:type="dxa" w:w="100"/>
+              <w:bottom w:type="dxa" w:w="60"/>
+              <w:right w:type="dxa" w:w="100"/>
+            </w:tcMar>
+          </w:tcPr>
+          <w:p>
+            <w:pPr>
+              <w:spacing w:after="20"/>
+            </w:pPr>
+            <w:r>
+              <w:rPr>
+                <w:rFonts w:ascii="Arial" w:cs="Arial" w:eastAsia="Arial" w:hAnsi="Arial"/>
+              </w:rPr>
+              <w:t xml:space="preserve">Gói miễn phí của Mistral/Gemini có thể dùng dữ liệu để huấn luyện</w:t>
+            </w:r>
+          </w:p>
+        </w:tc>
+      </w:tr>
+      <w:tr>
+        <w:tc>
+          <w:tcPr>
+            <w:tcW w:type="dxa" w:w="3084"/>
+            <w:tcBorders>
+              <w:top w:val="single" w:color="BFC7C5" w:sz="4"/>
+              <w:left w:val="single" w:color="BFC7C5" w:sz="4"/>
+              <w:bottom w:val="single" w:color="BFC7C5" w:sz="4"/>
+              <w:right w:val="single" w:color="BFC7C5" w:sz="4"/>
+            </w:tcBorders>
+            <w:tcMar>
+              <w:top w:type="dxa" w:w="60"/>
+              <w:left w:type="dxa" w:w="100"/>
+              <w:bottom w:type="dxa" w:w="60"/>
+              <w:right w:type="dxa" w:w="100"/>
+            </w:tcMar>
+          </w:tcPr>
+          <w:p>
+            <w:pPr>
+              <w:spacing w:after="20"/>
+            </w:pPr>
+            <w:r>
+              <w:rPr>
+                <w:rFonts w:ascii="Arial" w:cs="Arial" w:eastAsia="Arial" w:hAnsi="Arial"/>
+              </w:rPr>
+              <w:t xml:space="preserve">Tài liệu thường: báo, ghi chú, bài tập, công văn công khai</w:t>
+            </w:r>
+          </w:p>
+        </w:tc>
+        <w:tc>
+          <w:tcPr>
+            <w:tcW w:type="dxa" w:w="3662"/>
+            <w:tcBorders>
+              <w:top w:val="single" w:color="BFC7C5" w:sz="4"/>
+              <w:left w:val="single" w:color="BFC7C5" w:sz="4"/>
+              <w:bottom w:val="single" w:color="BFC7C5" w:sz="4"/>
+              <w:right w:val="single" w:color="BFC7C5" w:sz="4"/>
+            </w:tcBorders>
+            <w:tcMar>
+              <w:top w:type="dxa" w:w="60"/>
+              <w:left w:type="dxa" w:w="100"/>
+              <w:bottom w:type="dxa" w:w="60"/>
+              <w:right w:type="dxa" w:w="100"/>
+            </w:tcMar>
+          </w:tcPr>
+          <w:p>
+            <w:pPr>
+              <w:spacing w:after="20"/>
+            </w:pPr>
+            <w:r>
+              <w:rPr>
+                <w:rFonts w:ascii="Arial" w:cs="Arial" w:eastAsia="Arial" w:hAnsi="Arial"/>
+              </w:rPr>
+              <w:t xml:space="preserve">Lovable → Claude → Mistral → Gemini → trên máy</w:t>
+            </w:r>
+          </w:p>
+        </w:tc>
+        <w:tc>
+          <w:tcPr>
+            <w:tcW w:type="dxa" w:w="2892"/>
+            <w:tcBorders>
+              <w:top w:val="single" w:color="BFC7C5" w:sz="4"/>
+              <w:left w:val="single" w:color="BFC7C5" w:sz="4"/>
+              <w:bottom w:val="single" w:color="BFC7C5" w:sz="4"/>
+              <w:right w:val="single" w:color="BFC7C5" w:sz="4"/>
+            </w:tcBorders>
+            <w:tcMar>
+              <w:top w:type="dxa" w:w="60"/>
+              <w:left w:type="dxa" w:w="100"/>
+              <w:bottom w:type="dxa" w:w="60"/>
+              <w:right w:type="dxa" w:w="100"/>
+            </w:tcMar>
+          </w:tcPr>
+          <w:p>
+            <w:pPr>
+              <w:spacing w:after="20"/>
+            </w:pPr>
+            <w:r>
+              <w:rPr>
+                <w:rFonts w:ascii="Arial" w:cs="Arial" w:eastAsia="Arial" w:hAnsi="Arial"/>
+              </w:rPr>
+              <w:t xml:space="preserve">Tận dụng gói miễn phí</w:t>
+            </w:r>
+          </w:p>
+        </w:tc>
+      </w:tr>
+      <w:tr>
+        <w:tc>
+          <w:tcPr>
+            <w:tcW w:type="dxa" w:w="3084"/>
+            <w:tcBorders>
+              <w:top w:val="single" w:color="BFC7C5" w:sz="4"/>
+              <w:left w:val="single" w:color="BFC7C5" w:sz="4"/>
+              <w:bottom w:val="single" w:color="BFC7C5" w:sz="4"/>
+              <w:right w:val="single" w:color="BFC7C5" w:sz="4"/>
+            </w:tcBorders>
+            <w:tcMar>
+              <w:top w:type="dxa" w:w="60"/>
+              <w:left w:type="dxa" w:w="100"/>
+              <w:bottom w:type="dxa" w:w="60"/>
+              <w:right w:type="dxa" w:w="100"/>
+            </w:tcMar>
+          </w:tcPr>
+          <w:p>
+            <w:pPr>
+              <w:spacing w:after="20"/>
+            </w:pPr>
+            <w:r>
+              <w:rPr>
+                <w:rFonts w:ascii="Arial" w:cs="Arial" w:eastAsia="Arial" w:hAnsi="Arial"/>
+              </w:rPr>
+              <w:t xml:space="preserve">Tạo ảnh (Ảnh thẻ thay nền)</w:t>
+            </w:r>
+          </w:p>
+        </w:tc>
+        <w:tc>
+          <w:tcPr>
+            <w:tcW w:type="dxa" w:w="3662"/>
+            <w:tcBorders>
+              <w:top w:val="single" w:color="BFC7C5" w:sz="4"/>
+              <w:left w:val="single" w:color="BFC7C5" w:sz="4"/>
+              <w:bottom w:val="single" w:color="BFC7C5" w:sz="4"/>
+              <w:right w:val="single" w:color="BFC7C5" w:sz="4"/>
+            </w:tcBorders>
+            <w:tcMar>
+              <w:top w:type="dxa" w:w="60"/>
+              <w:left w:type="dxa" w:w="100"/>
+              <w:bottom w:type="dxa" w:w="60"/>
+              <w:right w:type="dxa" w:w="100"/>
+            </w:tcMar>
+          </w:tcPr>
+          <w:p>
+            <w:pPr>
+              <w:spacing w:after="20"/>
+            </w:pPr>
+            <w:r>
+              <w:rPr>
+                <w:rFonts w:ascii="Arial" w:cs="Arial" w:eastAsia="Arial" w:hAnsi="Arial"/>
+              </w:rPr>
+              <w:t xml:space="preserve">Lovable → tách nền trên máy (AI-03)</w:t>
+            </w:r>
+          </w:p>
+        </w:tc>
+        <w:tc>
+          <w:tcPr>
+            <w:tcW w:type="dxa" w:w="2892"/>
+            <w:tcBorders>
+              <w:top w:val="single" w:color="BFC7C5" w:sz="4"/>
+              <w:left w:val="single" w:color="BFC7C5" w:sz="4"/>
+              <w:bottom w:val="single" w:color="BFC7C5" w:sz="4"/>
+              <w:right w:val="single" w:color="BFC7C5" w:sz="4"/>
+            </w:tcBorders>
+            <w:tcMar>
+              <w:top w:type="dxa" w:w="60"/>
+              <w:left w:type="dxa" w:w="100"/>
+              <w:bottom w:type="dxa" w:w="60"/>
+              <w:right w:type="dxa" w:w="100"/>
+            </w:tcMar>
+          </w:tcPr>
+          <w:p>
+            <w:pPr>
+              <w:spacing w:after="20"/>
+            </w:pPr>
+            <w:r>
+              <w:rPr>
+                <w:rFonts w:ascii="Arial" w:cs="Arial" w:eastAsia="Arial" w:hAnsi="Arial"/>
+              </w:rPr>
+              <w:t xml:space="preserve">Claude/Mistral không tạo ảnh; tách nền trên máy không tốn tiền</w:t>
+            </w:r>
+          </w:p>
+        </w:tc>
+      </w:tr>
+    </w:tbl>
+    <w:p>
+      <w:pPr>
+        <w:spacing w:after="60"/>
+      </w:pPr>
+    </w:p>
+    <w:tbl>
+      <w:tblPr>
+        <w:tblW w:type="dxa" w:w="9638"/>
+        <w:tblBorders>
+          <w:top w:val="single" w:color="auto" w:sz="4"/>
+          <w:left w:val="single" w:color="auto" w:sz="4"/>
+          <w:bottom w:val="single" w:color="auto" w:sz="4"/>
+          <w:right w:val="single" w:color="auto" w:sz="4"/>
+          <w:insideH w:val="single" w:color="auto" w:sz="4"/>
+          <w:insideV w:val="single" w:color="auto" w:sz="4"/>
+        </w:tblBorders>
+      </w:tblPr>
+      <w:tblGrid>
+        <w:gridCol w:w="2120"/>
+        <w:gridCol w:w="2120"/>
+        <w:gridCol w:w="3277"/>
+        <w:gridCol w:w="2121"/>
+      </w:tblGrid>
+      <w:tr>
+        <w:trPr>
+          <w:tblHeader/>
+        </w:trPr>
+        <w:tc>
+          <w:tcPr>
+            <w:tcW w:type="dxa" w:w="2120"/>
+            <w:tcBorders>
+              <w:top w:val="single" w:color="BFC7C5" w:sz="4"/>
+              <w:left w:val="single" w:color="BFC7C5" w:sz="4"/>
+              <w:bottom w:val="single" w:color="BFC7C5" w:sz="4"/>
+              <w:right w:val="single" w:color="BFC7C5" w:sz="4"/>
+            </w:tcBorders>
+            <w:shd w:fill="006F59" w:color="auto" w:val="clear"/>
+            <w:tcMar>
+              <w:top w:type="dxa" w:w="60"/>
+              <w:left w:type="dxa" w:w="100"/>
+              <w:bottom w:type="dxa" w:w="60"/>
+              <w:right w:type="dxa" w:w="100"/>
+            </w:tcMar>
+          </w:tcPr>
+          <w:p>
+            <w:pPr>
+              <w:spacing w:after="20"/>
+            </w:pPr>
+            <w:r>
+              <w:rPr>
+                <w:rFonts w:ascii="Arial" w:cs="Arial" w:eastAsia="Arial" w:hAnsi="Arial"/>
+                <w:b/>
+                <w:bCs/>
+                <w:color w:val="FFFFFF"/>
+                <w:sz w:val="19"/>
+                <w:szCs w:val="19"/>
+              </w:rPr>
+              <w:t xml:space="preserve">Mô hình Claude</w:t>
+            </w:r>
+          </w:p>
+        </w:tc>
+        <w:tc>
+          <w:tcPr>
+            <w:tcW w:type="dxa" w:w="2120"/>
+            <w:tcBorders>
+              <w:top w:val="single" w:color="BFC7C5" w:sz="4"/>
+              <w:left w:val="single" w:color="BFC7C5" w:sz="4"/>
+              <w:bottom w:val="single" w:color="BFC7C5" w:sz="4"/>
+              <w:right w:val="single" w:color="BFC7C5" w:sz="4"/>
+            </w:tcBorders>
+            <w:shd w:fill="006F59" w:color="auto" w:val="clear"/>
+            <w:tcMar>
+              <w:top w:type="dxa" w:w="60"/>
+              <w:left w:type="dxa" w:w="100"/>
+              <w:bottom w:type="dxa" w:w="60"/>
+              <w:right w:type="dxa" w:w="100"/>
+            </w:tcMar>
+          </w:tcPr>
+          <w:p>
+            <w:pPr>
+              <w:spacing w:after="20"/>
+            </w:pPr>
+            <w:r>
+              <w:rPr>
+                <w:rFonts w:ascii="Arial" w:cs="Arial" w:eastAsia="Arial" w:hAnsi="Arial"/>
+                <w:b/>
+                <w:bCs/>
+                <w:color w:val="FFFFFF"/>
+                <w:sz w:val="19"/>
+                <w:szCs w:val="19"/>
+              </w:rPr>
+              <w:t xml:space="preserve">Giá (USD / 1 triệu token, vào / ra)</w:t>
+            </w:r>
+          </w:p>
+        </w:tc>
+        <w:tc>
+          <w:tcPr>
+            <w:tcW w:type="dxa" w:w="3277"/>
+            <w:tcBorders>
+              <w:top w:val="single" w:color="BFC7C5" w:sz="4"/>
+              <w:left w:val="single" w:color="BFC7C5" w:sz="4"/>
+              <w:bottom w:val="single" w:color="BFC7C5" w:sz="4"/>
+              <w:right w:val="single" w:color="BFC7C5" w:sz="4"/>
+            </w:tcBorders>
+            <w:shd w:fill="006F59" w:color="auto" w:val="clear"/>
+            <w:tcMar>
+              <w:top w:type="dxa" w:w="60"/>
+              <w:left w:type="dxa" w:w="100"/>
+              <w:bottom w:type="dxa" w:w="60"/>
+              <w:right w:type="dxa" w:w="100"/>
+            </w:tcMar>
+          </w:tcPr>
+          <w:p>
+            <w:pPr>
+              <w:spacing w:after="20"/>
+            </w:pPr>
+            <w:r>
+              <w:rPr>
+                <w:rFonts w:ascii="Arial" w:cs="Arial" w:eastAsia="Arial" w:hAnsi="Arial"/>
+                <w:b/>
+                <w:bCs/>
+                <w:color w:val="FFFFFF"/>
+                <w:sz w:val="19"/>
+                <w:szCs w:val="19"/>
+              </w:rPr>
+              <w:t xml:space="preserve">Ước tính 1 trang A4 (ảnh ~2.400 token vào, ~500 ra)</w:t>
+            </w:r>
+          </w:p>
+        </w:tc>
+        <w:tc>
+          <w:tcPr>
+            <w:tcW w:type="dxa" w:w="2121"/>
+            <w:tcBorders>
+              <w:top w:val="single" w:color="BFC7C5" w:sz="4"/>
+              <w:left w:val="single" w:color="BFC7C5" w:sz="4"/>
+              <w:bottom w:val="single" w:color="BFC7C5" w:sz="4"/>
+              <w:right w:val="single" w:color="BFC7C5" w:sz="4"/>
+            </w:tcBorders>
+            <w:shd w:fill="006F59" w:color="auto" w:val="clear"/>
+            <w:tcMar>
+              <w:top w:type="dxa" w:w="60"/>
+              <w:left w:type="dxa" w:w="100"/>
+              <w:bottom w:type="dxa" w:w="60"/>
+              <w:right w:type="dxa" w:w="100"/>
+            </w:tcMar>
+          </w:tcPr>
+          <w:p>
+            <w:pPr>
+              <w:spacing w:after="20"/>
+            </w:pPr>
+            <w:r>
+              <w:rPr>
+                <w:rFonts w:ascii="Arial" w:cs="Arial" w:eastAsia="Arial" w:hAnsi="Arial"/>
+                <w:b/>
+                <w:bCs/>
+                <w:color w:val="FFFFFF"/>
+                <w:sz w:val="19"/>
+                <w:szCs w:val="19"/>
+              </w:rPr>
+              <w:t xml:space="preserve">Dùng khi</w:t>
+            </w:r>
+          </w:p>
+        </w:tc>
+      </w:tr>
+      <w:tr>
+        <w:tc>
+          <w:tcPr>
+            <w:tcW w:type="dxa" w:w="2120"/>
+            <w:tcBorders>
+              <w:top w:val="single" w:color="BFC7C5" w:sz="4"/>
+              <w:left w:val="single" w:color="BFC7C5" w:sz="4"/>
+              <w:bottom w:val="single" w:color="BFC7C5" w:sz="4"/>
+              <w:right w:val="single" w:color="BFC7C5" w:sz="4"/>
+            </w:tcBorders>
+            <w:tcMar>
+              <w:top w:type="dxa" w:w="60"/>
+              <w:left w:type="dxa" w:w="100"/>
+              <w:bottom w:type="dxa" w:w="60"/>
+              <w:right w:type="dxa" w:w="100"/>
+            </w:tcMar>
+          </w:tcPr>
+          <w:p>
+            <w:pPr>
+              <w:spacing w:after="20"/>
+            </w:pPr>
+            <w:r>
+              <w:rPr>
+                <w:rFonts w:ascii="Arial" w:cs="Arial" w:eastAsia="Arial" w:hAnsi="Arial"/>
+              </w:rPr>
+              <w:t xml:space="preserve">claude-opus-5-5 (mặc định)</w:t>
+            </w:r>
+          </w:p>
+        </w:tc>
+        <w:tc>
+          <w:tcPr>
+            <w:tcW w:type="dxa" w:w="2120"/>
+            <w:tcBorders>
+              <w:top w:val="single" w:color="BFC7C5" w:sz="4"/>
+              <w:left w:val="single" w:color="BFC7C5" w:sz="4"/>
+              <w:bottom w:val="single" w:color="BFC7C5" w:sz="4"/>
+              <w:right w:val="single" w:color="BFC7C5" w:sz="4"/>
+            </w:tcBorders>
+            <w:tcMar>
+              <w:top w:type="dxa" w:w="60"/>
+              <w:left w:type="dxa" w:w="100"/>
+              <w:bottom w:type="dxa" w:w="60"/>
+              <w:right w:type="dxa" w:w="100"/>
+            </w:tcMar>
+          </w:tcPr>
+          <w:p>
+            <w:pPr>
+              <w:spacing w:after="20"/>
+            </w:pPr>
+            <w:r>
+              <w:rPr>
+                <w:rFonts w:ascii="Arial" w:cs="Arial" w:eastAsia="Arial" w:hAnsi="Arial"/>
+              </w:rPr>
+              <w:t xml:space="preserve">4 / 20</w:t>
+            </w:r>
+          </w:p>
+        </w:tc>
+        <w:tc>
+          <w:tcPr>
+            <w:tcW w:type="dxa" w:w="3277"/>
+            <w:tcBorders>
+              <w:top w:val="single" w:color="BFC7C5" w:sz="4"/>
+              <w:left w:val="single" w:color="BFC7C5" w:sz="4"/>
+              <w:bottom w:val="single" w:color="BFC7C5" w:sz="4"/>
+              <w:right w:val="single" w:color="BFC7C5" w:sz="4"/>
+            </w:tcBorders>
+            <w:tcMar>
+              <w:top w:type="dxa" w:w="60"/>
+              <w:left w:type="dxa" w:w="100"/>
+              <w:bottom w:type="dxa" w:w="60"/>
+              <w:right w:type="dxa" w:w="100"/>
+            </w:tcMar>
+          </w:tcPr>
+          <w:p>
+            <w:pPr>
+              <w:spacing w:after="20"/>
+            </w:pPr>
+            <w:r>
+              <w:rPr>
+                <w:rFonts w:ascii="Arial" w:cs="Arial" w:eastAsia="Arial" w:hAnsi="Arial"/>
+              </w:rPr>
+              <w:t xml:space="preserve">≈ 0,02 USD ≈ 500 đ (thêm phần suy luận nếu bật mức cao)</w:t>
+            </w:r>
+          </w:p>
+        </w:tc>
+        <w:tc>
+          <w:tcPr>
+            <w:tcW w:type="dxa" w:w="2121"/>
+            <w:tcBorders>
+              <w:top w:val="single" w:color="BFC7C5" w:sz="4"/>
+              <w:left w:val="single" w:color="BFC7C5" w:sz="4"/>
+              <w:bottom w:val="single" w:color="BFC7C5" w:sz="4"/>
+              <w:right w:val="single" w:color="BFC7C5" w:sz="4"/>
+            </w:tcBorders>
+            <w:tcMar>
+              <w:top w:type="dxa" w:w="60"/>
+              <w:left w:type="dxa" w:w="100"/>
+              <w:bottom w:type="dxa" w:w="60"/>
+              <w:right w:type="dxa" w:w="100"/>
+            </w:tcMar>
+          </w:tcPr>
+          <w:p>
+            <w:pPr>
+              <w:spacing w:after="20"/>
+            </w:pPr>
+            <w:r>
+              <w:rPr>
+                <w:rFonts w:ascii="Arial" w:cs="Arial" w:eastAsia="Arial" w:hAnsi="Arial"/>
+              </w:rPr>
+              <w:t xml:space="preserve">Bảng phức tạp, chữ viết tay, trích xuất cần chính xác</w:t>
+            </w:r>
+          </w:p>
+        </w:tc>
+      </w:tr>
+      <w:tr>
+        <w:tc>
+          <w:tcPr>
+            <w:tcW w:type="dxa" w:w="2120"/>
+            <w:tcBorders>
+              <w:top w:val="single" w:color="BFC7C5" w:sz="4"/>
+              <w:left w:val="single" w:color="BFC7C5" w:sz="4"/>
+              <w:bottom w:val="single" w:color="BFC7C5" w:sz="4"/>
+              <w:right w:val="single" w:color="BFC7C5" w:sz="4"/>
+            </w:tcBorders>
+            <w:tcMar>
+              <w:top w:type="dxa" w:w="60"/>
+              <w:left w:type="dxa" w:w="100"/>
+              <w:bottom w:type="dxa" w:w="60"/>
+              <w:right w:type="dxa" w:w="100"/>
+            </w:tcMar>
+          </w:tcPr>
+          <w:p>
+            <w:pPr>
+              <w:spacing w:after="20"/>
+            </w:pPr>
+            <w:r>
+              <w:rPr>
+                <w:rFonts w:ascii="Arial" w:cs="Arial" w:eastAsia="Arial" w:hAnsi="Arial"/>
+              </w:rPr>
+              <w:t xml:space="preserve">claude-sonnet-5-5</w:t>
+            </w:r>
+          </w:p>
+        </w:tc>
+        <w:tc>
+          <w:tcPr>
+            <w:tcW w:type="dxa" w:w="2120"/>
+            <w:tcBorders>
+              <w:top w:val="single" w:color="BFC7C5" w:sz="4"/>
+              <w:left w:val="single" w:color="BFC7C5" w:sz="4"/>
+              <w:bottom w:val="single" w:color="BFC7C5" w:sz="4"/>
+              <w:right w:val="single" w:color="BFC7C5" w:sz="4"/>
+            </w:tcBorders>
+            <w:tcMar>
+              <w:top w:type="dxa" w:w="60"/>
+              <w:left w:type="dxa" w:w="100"/>
+              <w:bottom w:type="dxa" w:w="60"/>
+              <w:right w:type="dxa" w:w="100"/>
+            </w:tcMar>
+          </w:tcPr>
+          <w:p>
+            <w:pPr>
+              <w:spacing w:after="20"/>
+            </w:pPr>
+            <w:r>
+              <w:rPr>
+                <w:rFonts w:ascii="Arial" w:cs="Arial" w:eastAsia="Arial" w:hAnsi="Arial"/>
+              </w:rPr>
+              <w:t xml:space="preserve">2 / 10</w:t>
+            </w:r>
+          </w:p>
+        </w:tc>
+        <w:tc>
+          <w:tcPr>
+            <w:tcW w:type="dxa" w:w="3277"/>
+            <w:tcBorders>
+              <w:top w:val="single" w:color="BFC7C5" w:sz="4"/>
+              <w:left w:val="single" w:color="BFC7C5" w:sz="4"/>
+              <w:bottom w:val="single" w:color="BFC7C5" w:sz="4"/>
+              <w:right w:val="single" w:color="BFC7C5" w:sz="4"/>
+            </w:tcBorders>
+            <w:tcMar>
+              <w:top w:type="dxa" w:w="60"/>
+              <w:left w:type="dxa" w:w="100"/>
+              <w:bottom w:type="dxa" w:w="60"/>
+              <w:right w:type="dxa" w:w="100"/>
+            </w:tcMar>
+          </w:tcPr>
+          <w:p>
+            <w:pPr>
+              <w:spacing w:after="20"/>
+            </w:pPr>
+            <w:r>
+              <w:rPr>
+                <w:rFonts w:ascii="Arial" w:cs="Arial" w:eastAsia="Arial" w:hAnsi="Arial"/>
+              </w:rPr>
+              <w:t xml:space="preserve">≈ 0,01 USD ≈ 250 đ</w:t>
+            </w:r>
+          </w:p>
+        </w:tc>
+        <w:tc>
+          <w:tcPr>
+            <w:tcW w:type="dxa" w:w="2121"/>
+            <w:tcBorders>
+              <w:top w:val="single" w:color="BFC7C5" w:sz="4"/>
+              <w:left w:val="single" w:color="BFC7C5" w:sz="4"/>
+              <w:bottom w:val="single" w:color="BFC7C5" w:sz="4"/>
+              <w:right w:val="single" w:color="BFC7C5" w:sz="4"/>
+            </w:tcBorders>
+            <w:tcMar>
+              <w:top w:type="dxa" w:w="60"/>
+              <w:left w:type="dxa" w:w="100"/>
+              <w:bottom w:type="dxa" w:w="60"/>
+              <w:right w:type="dxa" w:w="100"/>
+            </w:tcMar>
+          </w:tcPr>
+          <w:p>
+            <w:pPr>
+              <w:spacing w:after="20"/>
+            </w:pPr>
+            <w:r>
+              <w:rPr>
+                <w:rFonts w:ascii="Arial" w:cs="Arial" w:eastAsia="Arial" w:hAnsi="Arial"/>
+              </w:rPr>
+              <w:t xml:space="preserve">Cân bằng</w:t>
+            </w:r>
+          </w:p>
+        </w:tc>
+      </w:tr>
+      <w:tr>
+        <w:tc>
+          <w:tcPr>
+            <w:tcW w:type="dxa" w:w="2120"/>
+            <w:tcBorders>
+              <w:top w:val="single" w:color="BFC7C5" w:sz="4"/>
+              <w:left w:val="single" w:color="BFC7C5" w:sz="4"/>
+              <w:bottom w:val="single" w:color="BFC7C5" w:sz="4"/>
+              <w:right w:val="single" w:color="BFC7C5" w:sz="4"/>
+            </w:tcBorders>
+            <w:tcMar>
+              <w:top w:type="dxa" w:w="60"/>
+              <w:left w:type="dxa" w:w="100"/>
+              <w:bottom w:type="dxa" w:w="60"/>
+              <w:right w:type="dxa" w:w="100"/>
+            </w:tcMar>
+          </w:tcPr>
+          <w:p>
+            <w:pPr>
+              <w:spacing w:after="20"/>
+            </w:pPr>
+            <w:r>
+              <w:rPr>
+                <w:rFonts w:ascii="Arial" w:cs="Arial" w:eastAsia="Arial" w:hAnsi="Arial"/>
+              </w:rPr>
+              <w:t xml:space="preserve">claude-haiku-5-5</w:t>
+            </w:r>
+          </w:p>
+        </w:tc>
+        <w:tc>
+          <w:tcPr>
+            <w:tcW w:type="dxa" w:w="2120"/>
+            <w:tcBorders>
+              <w:top w:val="single" w:color="BFC7C5" w:sz="4"/>
+              <w:left w:val="single" w:color="BFC7C5" w:sz="4"/>
+              <w:bottom w:val="single" w:color="BFC7C5" w:sz="4"/>
+              <w:right w:val="single" w:color="BFC7C5" w:sz="4"/>
+            </w:tcBorders>
+            <w:tcMar>
+              <w:top w:type="dxa" w:w="60"/>
+              <w:left w:type="dxa" w:w="100"/>
+              <w:bottom w:type="dxa" w:w="60"/>
+              <w:right w:type="dxa" w:w="100"/>
+            </w:tcMar>
+          </w:tcPr>
+          <w:p>
+            <w:pPr>
+              <w:spacing w:after="20"/>
+            </w:pPr>
+            <w:r>
+              <w:rPr>
+                <w:rFonts w:ascii="Arial" w:cs="Arial" w:eastAsia="Arial" w:hAnsi="Arial"/>
+              </w:rPr>
+              <w:t xml:space="preserve">0,10 / 0,50</w:t>
+            </w:r>
+          </w:p>
+        </w:tc>
+        <w:tc>
+          <w:tcPr>
+            <w:tcW w:type="dxa" w:w="3277"/>
+            <w:tcBorders>
+              <w:top w:val="single" w:color="BFC7C5" w:sz="4"/>
+              <w:left w:val="single" w:color="BFC7C5" w:sz="4"/>
+              <w:bottom w:val="single" w:color="BFC7C5" w:sz="4"/>
+              <w:right w:val="single" w:color="BFC7C5" w:sz="4"/>
+            </w:tcBorders>
+            <w:tcMar>
+              <w:top w:type="dxa" w:w="60"/>
+              <w:left w:type="dxa" w:w="100"/>
+              <w:bottom w:type="dxa" w:w="60"/>
+              <w:right w:type="dxa" w:w="100"/>
+            </w:tcMar>
+          </w:tcPr>
+          <w:p>
+            <w:pPr>
+              <w:spacing w:after="20"/>
+            </w:pPr>
+            <w:r>
+              <w:rPr>
+                <w:rFonts w:ascii="Arial" w:cs="Arial" w:eastAsia="Arial" w:hAnsi="Arial"/>
+              </w:rPr>
+              <w:t xml:space="preserve">≈ 0,0005 USD ≈ 15 đ</w:t>
+            </w:r>
+          </w:p>
+        </w:tc>
+        <w:tc>
+          <w:tcPr>
+            <w:tcW w:type="dxa" w:w="2121"/>
+            <w:tcBorders>
+              <w:top w:val="single" w:color="BFC7C5" w:sz="4"/>
+              <w:left w:val="single" w:color="BFC7C5" w:sz="4"/>
+              <w:bottom w:val="single" w:color="BFC7C5" w:sz="4"/>
+              <w:right w:val="single" w:color="BFC7C5" w:sz="4"/>
+            </w:tcBorders>
+            <w:tcMar>
+              <w:top w:type="dxa" w:w="60"/>
+              <w:left w:type="dxa" w:w="100"/>
+              <w:bottom w:type="dxa" w:w="60"/>
+              <w:right w:type="dxa" w:w="100"/>
+            </w:tcMar>
+          </w:tcPr>
+          <w:p>
+            <w:pPr>
+              <w:spacing w:after="20"/>
+            </w:pPr>
+            <w:r>
+              <w:rPr>
+                <w:rFonts w:ascii="Arial" w:cs="Arial" w:eastAsia="Arial" w:hAnsi="Arial"/>
+              </w:rPr>
+              <w:t xml:space="preserve">Đặt tên, phân loại, tóm tắt, dịch, đọc chữ in</w:t>
+            </w:r>
+          </w:p>
+        </w:tc>
+      </w:tr>
+    </w:tbl>
+    <w:p>
+      <w:pPr>
+        <w:spacing w:after="60"/>
+      </w:pPr>
+    </w:p>
+    <w:p>
+      <w:pPr>
+        <w:spacing w:after="120" w:line="288"/>
+      </w:pPr>
+      <w:r>
+        <w:rPr>
+          <w:rFonts w:ascii="Arial" w:cs="Arial" w:eastAsia="Arial" w:hAnsi="Arial"/>
+        </w:rPr>
+        <w:t xml:space="preserve">Bạn chọn mô hình trong app; app không tự hạ mô hình để tiết kiệm. Gợi ý: Haiku cho việc nhẹ, Opus cho đọc bảng và trích xuất.</w:t>
+      </w:r>
+    </w:p>
+    <w:p>
+      <w:pPr>
+        <w:pStyle w:val="ListParagraph"/>
+        <w:numPr>
+          <w:ilvl w:val="0"/>
+          <w:numId w:val="3"/>
+        </w:numPr>
+        <w:spacing w:after="60" w:line="276"/>
+      </w:pPr>
+      <w:r>
+        <w:rPr>
+          <w:rFonts w:ascii="Arial" w:cs="Arial" w:eastAsia="Arial" w:hAnsi="Arial"/>
+          <w:b/>
+          <w:bCs/>
+        </w:rPr>
+        <w:t xml:space="preserve">“Không bị chặn”</w:t>
+      </w:r>
+      <w:r>
+        <w:rPr>
+          <w:rFonts w:ascii="Arial" w:cs="Arial" w:eastAsia="Arial" w:hAnsi="Arial"/>
+        </w:rPr>
+        <w:t xml:space="preserve"> gồm 3 phần. ① </w:t>
+      </w:r>
+      <w:r>
+        <w:rPr>
+          <w:rFonts w:ascii="Arial" w:cs="Arial" w:eastAsia="Arial" w:hAnsi="Arial"/>
+          <w:b/>
+          <w:bCs/>
+        </w:rPr>
+        <w:t xml:space="preserve">Không bị chặn vùng:</w:t>
+      </w:r>
+      <w:r>
+        <w:rPr>
+          <w:rFonts w:ascii="Arial" w:cs="Arial" w:eastAsia="Arial" w:hAnsi="Arial"/>
+        </w:rPr>
+        <w:t xml:space="preserve"> dùng key riêng gọi thẳng API chính thức; kiểm Việt Nam trong danh sách vùng hỗ trợ; nếu bị chặn thì nút Kiểm tra báo “Bị chặn vùng” và tự sang Mistral/Gemini. ② </w:t>
+      </w:r>
+      <w:r>
+        <w:rPr>
+          <w:rFonts w:ascii="Arial" w:cs="Arial" w:eastAsia="Arial" w:hAnsi="Arial"/>
+          <w:b/>
+          <w:bCs/>
+        </w:rPr>
+        <w:t xml:space="preserve">Không bị từ chối giữa chừng:</w:t>
+      </w:r>
+      <w:r>
+        <w:rPr>
+          <w:rFonts w:ascii="Arial" w:cs="Arial" w:eastAsia="Arial" w:hAnsi="Arial"/>
+        </w:rPr>
+        <w:t xml:space="preserve"> với Claude bật tham số fallbacks: "default" (beta server-side-fallback-2026-07-01) để yêu cầu bị bộ lọc an toàn từ chối được tự chạy lại trên mô hình phù hợp; app vẫn kiểm stop_reason = refusal rồi chuyển nguồn kế. ③ </w:t>
+      </w:r>
+      <w:r>
+        <w:rPr>
+          <w:rFonts w:ascii="Arial" w:cs="Arial" w:eastAsia="Arial" w:hAnsi="Arial"/>
+          <w:b/>
+          <w:bCs/>
+        </w:rPr>
+        <w:t xml:space="preserve">Không bị chặn vì hết lượt:</w:t>
+      </w:r>
+      <w:r>
+        <w:rPr>
+          <w:rFonts w:ascii="Arial" w:cs="Arial" w:eastAsia="Arial" w:hAnsi="Arial"/>
+        </w:rPr>
+        <w:t xml:space="preserve"> hết hạn mức hoặc 429 thì chuyển nguồn kế và hiện nguồn đang dùng.</w:t>
+      </w:r>
+    </w:p>
+    <w:p>
+      <w:pPr>
+        <w:pStyle w:val="ListParagraph"/>
+        <w:numPr>
+          <w:ilvl w:val="0"/>
+          <w:numId w:val="3"/>
+        </w:numPr>
+        <w:spacing w:after="60" w:line="276"/>
+      </w:pPr>
+      <w:r>
+        <w:rPr>
+          <w:rFonts w:ascii="Arial" w:cs="Arial" w:eastAsia="Arial" w:hAnsi="Arial"/>
+          <w:b/>
+          <w:bCs/>
+        </w:rPr>
+        <w:t xml:space="preserve">Không có cách dùng Claude “miễn phí” hợp lệ qua API:</w:t>
+      </w:r>
+      <w:r>
+        <w:rPr>
+          <w:rFonts w:ascii="Arial" w:cs="Arial" w:eastAsia="Arial" w:hAnsi="Arial"/>
+        </w:rPr>
+        <w:t xml:space="preserve"> gói Claude miễn phí trên claude.ai là ứng dụng trò chuyện, không có key để app gọi. Các trang hứa “Claude API miễn phí” qua bên trung gian không chính thức có rủi ro lộ tài liệu, không nên dùng. Nguồn miễn phí hợp lệ trong chuỗi là Mistral và Gemini.</w:t>
+      </w:r>
+    </w:p>
+    <w:p>
+      <w:pPr>
+        <w:pStyle w:val="Heading2"/>
+      </w:pPr>
+      <w:r>
+        <w:rPr>
+          <w:rFonts w:ascii="Arial" w:cs="Arial" w:eastAsia="Arial" w:hAnsi="Arial"/>
+        </w:rPr>
+        <w:t xml:space="preserve">12.7 Hạng mục AI</w:t>
       </w:r>
     </w:p>
     <w:tbl>
@@ -21665,6 +23782,234 @@
                 <w:rFonts w:ascii="Arial" w:cs="Arial" w:eastAsia="Arial" w:hAnsi="Arial"/>
               </w:rPr>
               <w:t xml:space="preserve">Hiện đúng trạng thái khi tắt từng key</w:t>
+            </w:r>
+          </w:p>
+        </w:tc>
+        <w:tc>
+          <w:tcPr>
+            <w:tcW w:type="dxa" w:w="771"/>
+            <w:tcBorders>
+              <w:top w:val="single" w:color="BFC7C5" w:sz="4"/>
+              <w:left w:val="single" w:color="BFC7C5" w:sz="4"/>
+              <w:bottom w:val="single" w:color="BFC7C5" w:sz="4"/>
+              <w:right w:val="single" w:color="BFC7C5" w:sz="4"/>
+            </w:tcBorders>
+            <w:tcMar>
+              <w:top w:type="dxa" w:w="60"/>
+              <w:left w:type="dxa" w:w="100"/>
+              <w:bottom w:type="dxa" w:w="60"/>
+              <w:right w:type="dxa" w:w="100"/>
+            </w:tcMar>
+          </w:tcPr>
+          <w:p>
+            <w:pPr>
+              <w:spacing w:after="20"/>
+            </w:pPr>
+            <w:r>
+              <w:rPr>
+                <w:rFonts w:ascii="Arial" w:cs="Arial" w:eastAsia="Arial" w:hAnsi="Arial"/>
+              </w:rPr>
+              <w:t xml:space="preserve">S</w:t>
+            </w:r>
+          </w:p>
+        </w:tc>
+      </w:tr>
+      <w:tr>
+        <w:tc>
+          <w:tcPr>
+            <w:tcW w:type="dxa" w:w="867"/>
+            <w:tcBorders>
+              <w:top w:val="single" w:color="BFC7C5" w:sz="4"/>
+              <w:left w:val="single" w:color="BFC7C5" w:sz="4"/>
+              <w:bottom w:val="single" w:color="BFC7C5" w:sz="4"/>
+              <w:right w:val="single" w:color="BFC7C5" w:sz="4"/>
+            </w:tcBorders>
+            <w:tcMar>
+              <w:top w:type="dxa" w:w="60"/>
+              <w:left w:type="dxa" w:w="100"/>
+              <w:bottom w:type="dxa" w:w="60"/>
+              <w:right w:type="dxa" w:w="100"/>
+            </w:tcMar>
+          </w:tcPr>
+          <w:p>
+            <w:pPr>
+              <w:spacing w:after="20"/>
+            </w:pPr>
+            <w:r>
+              <w:rPr>
+                <w:rFonts w:ascii="Arial" w:cs="Arial" w:eastAsia="Arial" w:hAnsi="Arial"/>
+              </w:rPr>
+              <w:t xml:space="preserve">AI-04</w:t>
+            </w:r>
+          </w:p>
+        </w:tc>
+        <w:tc>
+          <w:tcPr>
+            <w:tcW w:type="dxa" w:w="5301"/>
+            <w:tcBorders>
+              <w:top w:val="single" w:color="BFC7C5" w:sz="4"/>
+              <w:left w:val="single" w:color="BFC7C5" w:sz="4"/>
+              <w:bottom w:val="single" w:color="BFC7C5" w:sz="4"/>
+              <w:right w:val="single" w:color="BFC7C5" w:sz="4"/>
+            </w:tcBorders>
+            <w:tcMar>
+              <w:top w:type="dxa" w:w="60"/>
+              <w:left w:type="dxa" w:w="100"/>
+              <w:bottom w:type="dxa" w:w="60"/>
+              <w:right w:type="dxa" w:w="100"/>
+            </w:tcMar>
+          </w:tcPr>
+          <w:p>
+            <w:pPr>
+              <w:spacing w:after="20"/>
+            </w:pPr>
+            <w:r>
+              <w:rPr>
+                <w:rFonts w:ascii="Arial" w:cs="Arial" w:eastAsia="Arial" w:hAnsi="Arial"/>
+              </w:rPr>
+              <w:t xml:space="preserve">Khoá AI trong app (QD-12): màn Khoá AI của tôi; lưu mã hoá trên máy/két PIN; gọi thẳng từ trình duyệt hoặc qua máy chủ; nút Kiểm tra; chọn mô hình; đổi thứ tự.</w:t>
+            </w:r>
+          </w:p>
+        </w:tc>
+        <w:tc>
+          <w:tcPr>
+            <w:tcW w:type="dxa" w:w="2699"/>
+            <w:tcBorders>
+              <w:top w:val="single" w:color="BFC7C5" w:sz="4"/>
+              <w:left w:val="single" w:color="BFC7C5" w:sz="4"/>
+              <w:bottom w:val="single" w:color="BFC7C5" w:sz="4"/>
+              <w:right w:val="single" w:color="BFC7C5" w:sz="4"/>
+            </w:tcBorders>
+            <w:tcMar>
+              <w:top w:type="dxa" w:w="60"/>
+              <w:left w:type="dxa" w:w="100"/>
+              <w:bottom w:type="dxa" w:w="60"/>
+              <w:right w:type="dxa" w:w="100"/>
+            </w:tcMar>
+          </w:tcPr>
+          <w:p>
+            <w:pPr>
+              <w:spacing w:after="20"/>
+            </w:pPr>
+            <w:r>
+              <w:rPr>
+                <w:rFonts w:ascii="Arial" w:cs="Arial" w:eastAsia="Arial" w:hAnsi="Arial"/>
+              </w:rPr>
+              <w:t xml:space="preserve">Nhập key Claude → Kiểm tra “Sẵn sàng”; tắt mạng tới Lovable vẫn chạy; key không có trong tệp sao lưu</w:t>
+            </w:r>
+          </w:p>
+        </w:tc>
+        <w:tc>
+          <w:tcPr>
+            <w:tcW w:type="dxa" w:w="771"/>
+            <w:tcBorders>
+              <w:top w:val="single" w:color="BFC7C5" w:sz="4"/>
+              <w:left w:val="single" w:color="BFC7C5" w:sz="4"/>
+              <w:bottom w:val="single" w:color="BFC7C5" w:sz="4"/>
+              <w:right w:val="single" w:color="BFC7C5" w:sz="4"/>
+            </w:tcBorders>
+            <w:tcMar>
+              <w:top w:type="dxa" w:w="60"/>
+              <w:left w:type="dxa" w:w="100"/>
+              <w:bottom w:type="dxa" w:w="60"/>
+              <w:right w:type="dxa" w:w="100"/>
+            </w:tcMar>
+          </w:tcPr>
+          <w:p>
+            <w:pPr>
+              <w:spacing w:after="20"/>
+            </w:pPr>
+            <w:r>
+              <w:rPr>
+                <w:rFonts w:ascii="Arial" w:cs="Arial" w:eastAsia="Arial" w:hAnsi="Arial"/>
+              </w:rPr>
+              <w:t xml:space="preserve">M</w:t>
+            </w:r>
+          </w:p>
+        </w:tc>
+      </w:tr>
+      <w:tr>
+        <w:tc>
+          <w:tcPr>
+            <w:tcW w:type="dxa" w:w="867"/>
+            <w:tcBorders>
+              <w:top w:val="single" w:color="BFC7C5" w:sz="4"/>
+              <w:left w:val="single" w:color="BFC7C5" w:sz="4"/>
+              <w:bottom w:val="single" w:color="BFC7C5" w:sz="4"/>
+              <w:right w:val="single" w:color="BFC7C5" w:sz="4"/>
+            </w:tcBorders>
+            <w:tcMar>
+              <w:top w:type="dxa" w:w="60"/>
+              <w:left w:type="dxa" w:w="100"/>
+              <w:bottom w:type="dxa" w:w="60"/>
+              <w:right w:type="dxa" w:w="100"/>
+            </w:tcMar>
+          </w:tcPr>
+          <w:p>
+            <w:pPr>
+              <w:spacing w:after="20"/>
+            </w:pPr>
+            <w:r>
+              <w:rPr>
+                <w:rFonts w:ascii="Arial" w:cs="Arial" w:eastAsia="Arial" w:hAnsi="Arial"/>
+              </w:rPr>
+              <w:t xml:space="preserve">AI-05</w:t>
+            </w:r>
+          </w:p>
+        </w:tc>
+        <w:tc>
+          <w:tcPr>
+            <w:tcW w:type="dxa" w:w="5301"/>
+            <w:tcBorders>
+              <w:top w:val="single" w:color="BFC7C5" w:sz="4"/>
+              <w:left w:val="single" w:color="BFC7C5" w:sz="4"/>
+              <w:bottom w:val="single" w:color="BFC7C5" w:sz="4"/>
+              <w:right w:val="single" w:color="BFC7C5" w:sz="4"/>
+            </w:tcBorders>
+            <w:tcMar>
+              <w:top w:type="dxa" w:w="60"/>
+              <w:left w:type="dxa" w:w="100"/>
+              <w:bottom w:type="dxa" w:w="60"/>
+              <w:right w:type="dxa" w:w="100"/>
+            </w:tcMar>
+          </w:tcPr>
+          <w:p>
+            <w:pPr>
+              <w:spacing w:after="20"/>
+            </w:pPr>
+            <w:r>
+              <w:rPr>
+                <w:rFonts w:ascii="Arial" w:cs="Arial" w:eastAsia="Arial" w:hAnsi="Arial"/>
+              </w:rPr>
+              <w:t xml:space="preserve">Định tuyến theo độ nhạy cảm + fallbacks khi bị từ chối (QD-13): giấy tờ nhạy cảm không gửi nguồn miễn phí; xử lý refusal/429/hết hạn mức.</w:t>
+            </w:r>
+          </w:p>
+        </w:tc>
+        <w:tc>
+          <w:tcPr>
+            <w:tcW w:type="dxa" w:w="2699"/>
+            <w:tcBorders>
+              <w:top w:val="single" w:color="BFC7C5" w:sz="4"/>
+              <w:left w:val="single" w:color="BFC7C5" w:sz="4"/>
+              <w:bottom w:val="single" w:color="BFC7C5" w:sz="4"/>
+              <w:right w:val="single" w:color="BFC7C5" w:sz="4"/>
+            </w:tcBorders>
+            <w:tcMar>
+              <w:top w:type="dxa" w:w="60"/>
+              <w:left w:type="dxa" w:w="100"/>
+              <w:bottom w:type="dxa" w:w="60"/>
+              <w:right w:type="dxa" w:w="100"/>
+            </w:tcMar>
+          </w:tcPr>
+          <w:p>
+            <w:pPr>
+              <w:spacing w:after="20"/>
+            </w:pPr>
+            <w:r>
+              <w:rPr>
+                <w:rFonts w:ascii="Arial" w:cs="Arial" w:eastAsia="Arial" w:hAnsi="Arial"/>
+              </w:rPr>
+              <w:t xml:space="preserve">CCCD mẫu không bao giờ tới Mistral/Gemini (kiểm thử); refusal giả → nguồn kế</w:t>
             </w:r>
           </w:p>
         </w:tc>
@@ -39359,6 +41704,346 @@
               <w:rPr>
                 <w:rFonts w:ascii="Arial" w:cs="Arial" w:eastAsia="Arial" w:hAnsi="Arial"/>
               </w:rPr>
+              <w:t xml:space="preserve">AI-04</w:t>
+            </w:r>
+          </w:p>
+        </w:tc>
+        <w:tc>
+          <w:tcPr>
+            <w:tcW w:type="dxa" w:w="3470"/>
+            <w:tcBorders>
+              <w:top w:val="single" w:color="BFC7C5" w:sz="4"/>
+              <w:left w:val="single" w:color="BFC7C5" w:sz="4"/>
+              <w:bottom w:val="single" w:color="BFC7C5" w:sz="4"/>
+              <w:right w:val="single" w:color="BFC7C5" w:sz="4"/>
+            </w:tcBorders>
+            <w:tcMar>
+              <w:top w:type="dxa" w:w="60"/>
+              <w:left w:type="dxa" w:w="100"/>
+              <w:bottom w:type="dxa" w:w="60"/>
+              <w:right w:type="dxa" w:w="100"/>
+            </w:tcMar>
+          </w:tcPr>
+          <w:p>
+            <w:pPr>
+              <w:spacing w:after="20"/>
+            </w:pPr>
+            <w:r>
+              <w:rPr>
+                <w:rFonts w:ascii="Arial" w:cs="Arial" w:eastAsia="Arial" w:hAnsi="Arial"/>
+              </w:rPr>
+              <w:t xml:space="preserve">Khoá AI trong app: nhập/đổi/xoá key, mã hoá trên máy, gọi thẳng từ trình duyệt, chọn mô hình, kiểm tra (QD-12).</w:t>
+            </w:r>
+          </w:p>
+        </w:tc>
+        <w:tc>
+          <w:tcPr>
+            <w:tcW w:type="dxa" w:w="1735"/>
+            <w:tcBorders>
+              <w:top w:val="single" w:color="BFC7C5" w:sz="4"/>
+              <w:left w:val="single" w:color="BFC7C5" w:sz="4"/>
+              <w:bottom w:val="single" w:color="BFC7C5" w:sz="4"/>
+              <w:right w:val="single" w:color="BFC7C5" w:sz="4"/>
+            </w:tcBorders>
+            <w:tcMar>
+              <w:top w:type="dxa" w:w="60"/>
+              <w:left w:type="dxa" w:w="100"/>
+              <w:bottom w:type="dxa" w:w="60"/>
+              <w:right w:type="dxa" w:w="100"/>
+            </w:tcMar>
+          </w:tcPr>
+          <w:p>
+            <w:pPr>
+              <w:spacing w:after="20"/>
+            </w:pPr>
+            <w:r>
+              <w:rPr>
+                <w:rFonts w:ascii="Arial" w:cs="Arial" w:eastAsia="Arial" w:hAnsi="Arial"/>
+              </w:rPr>
+              <w:t xml:space="preserve">lib/ai-keys.ts, components/ai-keys-panel.tsx, lib/ai-providers.ts, routes/me.tsx</w:t>
+            </w:r>
+          </w:p>
+        </w:tc>
+        <w:tc>
+          <w:tcPr>
+            <w:tcW w:type="dxa" w:w="2120"/>
+            <w:tcBorders>
+              <w:top w:val="single" w:color="BFC7C5" w:sz="4"/>
+              <w:left w:val="single" w:color="BFC7C5" w:sz="4"/>
+              <w:bottom w:val="single" w:color="BFC7C5" w:sz="4"/>
+              <w:right w:val="single" w:color="BFC7C5" w:sz="4"/>
+            </w:tcBorders>
+            <w:tcMar>
+              <w:top w:type="dxa" w:w="60"/>
+              <w:left w:type="dxa" w:w="100"/>
+              <w:bottom w:type="dxa" w:w="60"/>
+              <w:right w:type="dxa" w:w="100"/>
+            </w:tcMar>
+          </w:tcPr>
+          <w:p>
+            <w:pPr>
+              <w:spacing w:after="20"/>
+            </w:pPr>
+            <w:r>
+              <w:rPr>
+                <w:rFonts w:ascii="Arial" w:cs="Arial" w:eastAsia="Arial" w:hAnsi="Arial"/>
+              </w:rPr>
+              <w:t xml:space="preserve">Key Claude chạy khi Lovable hết credit</w:t>
+            </w:r>
+          </w:p>
+        </w:tc>
+        <w:tc>
+          <w:tcPr>
+            <w:tcW w:type="dxa" w:w="482"/>
+            <w:tcBorders>
+              <w:top w:val="single" w:color="BFC7C5" w:sz="4"/>
+              <w:left w:val="single" w:color="BFC7C5" w:sz="4"/>
+              <w:bottom w:val="single" w:color="BFC7C5" w:sz="4"/>
+              <w:right w:val="single" w:color="BFC7C5" w:sz="4"/>
+            </w:tcBorders>
+            <w:tcMar>
+              <w:top w:type="dxa" w:w="60"/>
+              <w:left w:type="dxa" w:w="100"/>
+              <w:bottom w:type="dxa" w:w="60"/>
+              <w:right w:type="dxa" w:w="100"/>
+            </w:tcMar>
+          </w:tcPr>
+          <w:p>
+            <w:pPr>
+              <w:spacing w:after="20"/>
+            </w:pPr>
+            <w:r>
+              <w:rPr>
+                <w:rFonts w:ascii="Arial" w:cs="Arial" w:eastAsia="Arial" w:hAnsi="Arial"/>
+              </w:rPr>
+              <w:t xml:space="preserve">M</w:t>
+            </w:r>
+          </w:p>
+        </w:tc>
+        <w:tc>
+          <w:tcPr>
+            <w:tcW w:type="dxa" w:w="867"/>
+            <w:tcBorders>
+              <w:top w:val="single" w:color="BFC7C5" w:sz="4"/>
+              <w:left w:val="single" w:color="BFC7C5" w:sz="4"/>
+              <w:bottom w:val="single" w:color="BFC7C5" w:sz="4"/>
+              <w:right w:val="single" w:color="BFC7C5" w:sz="4"/>
+            </w:tcBorders>
+            <w:tcMar>
+              <w:top w:type="dxa" w:w="60"/>
+              <w:left w:type="dxa" w:w="100"/>
+              <w:bottom w:type="dxa" w:w="60"/>
+              <w:right w:type="dxa" w:w="100"/>
+            </w:tcMar>
+          </w:tcPr>
+          <w:p>
+            <w:pPr>
+              <w:spacing w:after="20"/>
+            </w:pPr>
+            <w:r>
+              <w:rPr>
+                <w:rFonts w:ascii="Arial" w:cs="Arial" w:eastAsia="Arial" w:hAnsi="Arial"/>
+              </w:rPr>
+              <w:t xml:space="preserve">AI-01</w:t>
+            </w:r>
+          </w:p>
+        </w:tc>
+      </w:tr>
+      <w:tr>
+        <w:tc>
+          <w:tcPr>
+            <w:tcW w:type="dxa" w:w="964"/>
+            <w:tcBorders>
+              <w:top w:val="single" w:color="BFC7C5" w:sz="4"/>
+              <w:left w:val="single" w:color="BFC7C5" w:sz="4"/>
+              <w:bottom w:val="single" w:color="BFC7C5" w:sz="4"/>
+              <w:right w:val="single" w:color="BFC7C5" w:sz="4"/>
+            </w:tcBorders>
+            <w:tcMar>
+              <w:top w:type="dxa" w:w="60"/>
+              <w:left w:type="dxa" w:w="100"/>
+              <w:bottom w:type="dxa" w:w="60"/>
+              <w:right w:type="dxa" w:w="100"/>
+            </w:tcMar>
+          </w:tcPr>
+          <w:p>
+            <w:pPr>
+              <w:spacing w:after="20"/>
+            </w:pPr>
+            <w:r>
+              <w:rPr>
+                <w:rFonts w:ascii="Arial" w:cs="Arial" w:eastAsia="Arial" w:hAnsi="Arial"/>
+              </w:rPr>
+              <w:t xml:space="preserve">AI-05</w:t>
+            </w:r>
+          </w:p>
+        </w:tc>
+        <w:tc>
+          <w:tcPr>
+            <w:tcW w:type="dxa" w:w="3470"/>
+            <w:tcBorders>
+              <w:top w:val="single" w:color="BFC7C5" w:sz="4"/>
+              <w:left w:val="single" w:color="BFC7C5" w:sz="4"/>
+              <w:bottom w:val="single" w:color="BFC7C5" w:sz="4"/>
+              <w:right w:val="single" w:color="BFC7C5" w:sz="4"/>
+            </w:tcBorders>
+            <w:tcMar>
+              <w:top w:type="dxa" w:w="60"/>
+              <w:left w:type="dxa" w:w="100"/>
+              <w:bottom w:type="dxa" w:w="60"/>
+              <w:right w:type="dxa" w:w="100"/>
+            </w:tcMar>
+          </w:tcPr>
+          <w:p>
+            <w:pPr>
+              <w:spacing w:after="20"/>
+            </w:pPr>
+            <w:r>
+              <w:rPr>
+                <w:rFonts w:ascii="Arial" w:cs="Arial" w:eastAsia="Arial" w:hAnsi="Arial"/>
+              </w:rPr>
+              <w:t xml:space="preserve">Định tuyến theo độ nhạy cảm + fallbacks Claude + chuyển nguồn khi refusal/429 (QD-13).</w:t>
+            </w:r>
+          </w:p>
+        </w:tc>
+        <w:tc>
+          <w:tcPr>
+            <w:tcW w:type="dxa" w:w="1735"/>
+            <w:tcBorders>
+              <w:top w:val="single" w:color="BFC7C5" w:sz="4"/>
+              <w:left w:val="single" w:color="BFC7C5" w:sz="4"/>
+              <w:bottom w:val="single" w:color="BFC7C5" w:sz="4"/>
+              <w:right w:val="single" w:color="BFC7C5" w:sz="4"/>
+            </w:tcBorders>
+            <w:tcMar>
+              <w:top w:type="dxa" w:w="60"/>
+              <w:left w:type="dxa" w:w="100"/>
+              <w:bottom w:type="dxa" w:w="60"/>
+              <w:right w:type="dxa" w:w="100"/>
+            </w:tcMar>
+          </w:tcPr>
+          <w:p>
+            <w:pPr>
+              <w:spacing w:after="20"/>
+            </w:pPr>
+            <w:r>
+              <w:rPr>
+                <w:rFonts w:ascii="Arial" w:cs="Arial" w:eastAsia="Arial" w:hAnsi="Arial"/>
+              </w:rPr>
+              <w:t xml:space="preserve">lib/ai-providers.ts, lib/sensitive.ts</w:t>
+            </w:r>
+          </w:p>
+        </w:tc>
+        <w:tc>
+          <w:tcPr>
+            <w:tcW w:type="dxa" w:w="2120"/>
+            <w:tcBorders>
+              <w:top w:val="single" w:color="BFC7C5" w:sz="4"/>
+              <w:left w:val="single" w:color="BFC7C5" w:sz="4"/>
+              <w:bottom w:val="single" w:color="BFC7C5" w:sz="4"/>
+              <w:right w:val="single" w:color="BFC7C5" w:sz="4"/>
+            </w:tcBorders>
+            <w:tcMar>
+              <w:top w:type="dxa" w:w="60"/>
+              <w:left w:type="dxa" w:w="100"/>
+              <w:bottom w:type="dxa" w:w="60"/>
+              <w:right w:type="dxa" w:w="100"/>
+            </w:tcMar>
+          </w:tcPr>
+          <w:p>
+            <w:pPr>
+              <w:spacing w:after="20"/>
+            </w:pPr>
+            <w:r>
+              <w:rPr>
+                <w:rFonts w:ascii="Arial" w:cs="Arial" w:eastAsia="Arial" w:hAnsi="Arial"/>
+              </w:rPr>
+              <w:t xml:space="preserve">Giấy tờ nhạy cảm không tới nguồn miễn phí</w:t>
+            </w:r>
+          </w:p>
+        </w:tc>
+        <w:tc>
+          <w:tcPr>
+            <w:tcW w:type="dxa" w:w="482"/>
+            <w:tcBorders>
+              <w:top w:val="single" w:color="BFC7C5" w:sz="4"/>
+              <w:left w:val="single" w:color="BFC7C5" w:sz="4"/>
+              <w:bottom w:val="single" w:color="BFC7C5" w:sz="4"/>
+              <w:right w:val="single" w:color="BFC7C5" w:sz="4"/>
+            </w:tcBorders>
+            <w:tcMar>
+              <w:top w:type="dxa" w:w="60"/>
+              <w:left w:type="dxa" w:w="100"/>
+              <w:bottom w:type="dxa" w:w="60"/>
+              <w:right w:type="dxa" w:w="100"/>
+            </w:tcMar>
+          </w:tcPr>
+          <w:p>
+            <w:pPr>
+              <w:spacing w:after="20"/>
+            </w:pPr>
+            <w:r>
+              <w:rPr>
+                <w:rFonts w:ascii="Arial" w:cs="Arial" w:eastAsia="Arial" w:hAnsi="Arial"/>
+              </w:rPr>
+              <w:t xml:space="preserve">S</w:t>
+            </w:r>
+          </w:p>
+        </w:tc>
+        <w:tc>
+          <w:tcPr>
+            <w:tcW w:type="dxa" w:w="867"/>
+            <w:tcBorders>
+              <w:top w:val="single" w:color="BFC7C5" w:sz="4"/>
+              <w:left w:val="single" w:color="BFC7C5" w:sz="4"/>
+              <w:bottom w:val="single" w:color="BFC7C5" w:sz="4"/>
+              <w:right w:val="single" w:color="BFC7C5" w:sz="4"/>
+            </w:tcBorders>
+            <w:tcMar>
+              <w:top w:type="dxa" w:w="60"/>
+              <w:left w:type="dxa" w:w="100"/>
+              <w:bottom w:type="dxa" w:w="60"/>
+              <w:right w:type="dxa" w:w="100"/>
+            </w:tcMar>
+          </w:tcPr>
+          <w:p>
+            <w:pPr>
+              <w:spacing w:after="20"/>
+            </w:pPr>
+            <w:r>
+              <w:rPr>
+                <w:rFonts w:ascii="Arial" w:cs="Arial" w:eastAsia="Arial" w:hAnsi="Arial"/>
+              </w:rPr>
+              <w:t xml:space="preserve">AI-04</w:t>
+            </w:r>
+          </w:p>
+        </w:tc>
+      </w:tr>
+      <w:tr>
+        <w:tc>
+          <w:tcPr>
+            <w:tcW w:type="dxa" w:w="964"/>
+            <w:tcBorders>
+              <w:top w:val="single" w:color="BFC7C5" w:sz="4"/>
+              <w:left w:val="single" w:color="BFC7C5" w:sz="4"/>
+              <w:bottom w:val="single" w:color="BFC7C5" w:sz="4"/>
+              <w:right w:val="single" w:color="BFC7C5" w:sz="4"/>
+            </w:tcBorders>
+            <w:tcMar>
+              <w:top w:type="dxa" w:w="60"/>
+              <w:left w:type="dxa" w:w="100"/>
+              <w:bottom w:type="dxa" w:w="60"/>
+              <w:right w:type="dxa" w:w="100"/>
+            </w:tcMar>
+          </w:tcPr>
+          <w:p>
+            <w:pPr>
+              <w:spacing w:after="20"/>
+            </w:pPr>
+            <w:r>
+              <w:rPr>
+                <w:rFonts w:ascii="Arial" w:cs="Arial" w:eastAsia="Arial" w:hAnsi="Arial"/>
+              </w:rPr>
               <w:t xml:space="preserve">AI-03</w:t>
             </w:r>
           </w:p>
@@ -41560,7 +44245,7 @@
               <w:rPr>
                 <w:rFonts w:ascii="Arial" w:cs="Arial" w:eastAsia="Arial" w:hAnsi="Arial"/>
               </w:rPr>
-              <w:t xml:space="preserve">AI-01, AI-02, TF-01</w:t>
+              <w:t xml:space="preserve">AI-01, AI-04, AI-05, TF-01</w:t>
             </w:r>
           </w:p>
         </w:tc>
@@ -41588,7 +44273,7 @@
               <w:rPr>
                 <w:rFonts w:ascii="Arial" w:cs="Arial" w:eastAsia="Arial" w:hAnsi="Arial"/>
               </w:rPr>
-              <w:t xml:space="preserve">AI không dừng khi Lovable hết credit; nút Chia sẻ/Zalo không còn im lặng</w:t>
+              <w:t xml:space="preserve">Dán key Claude/Mistral/Gemini trong app; AI không dừng khi Lovable hết credit; Chia sẻ/Zalo không còn im lặng</w:t>
             </w:r>
           </w:p>
         </w:tc>
@@ -42334,7 +45019,7 @@
               <w:rPr>
                 <w:rFonts w:ascii="Arial" w:cs="Arial" w:eastAsia="Arial" w:hAnsi="Arial"/>
               </w:rPr>
-              <w:t xml:space="preserve">FX-01, FX-02, FX-03, AI-03</w:t>
+              <w:t xml:space="preserve">FX-01, FX-02, FX-03, AI-02, AI-03</w:t>
             </w:r>
           </w:p>
         </w:tc>
@@ -44084,7 +46769,7 @@
         <w:pStyle w:val="ListParagraph"/>
         <w:numPr>
           <w:ilvl w:val="0"/>
-          <w:numId w:val="4"/>
+          <w:numId w:val="3"/>
         </w:numPr>
         <w:spacing w:after="60" w:line="276"/>
       </w:pPr>
@@ -44100,7 +46785,7 @@
         <w:pStyle w:val="ListParagraph"/>
         <w:numPr>
           <w:ilvl w:val="0"/>
-          <w:numId w:val="4"/>
+          <w:numId w:val="3"/>
         </w:numPr>
         <w:spacing w:after="60" w:line="276"/>
       </w:pPr>
@@ -44116,7 +46801,7 @@
         <w:pStyle w:val="ListParagraph"/>
         <w:numPr>
           <w:ilvl w:val="0"/>
-          <w:numId w:val="4"/>
+          <w:numId w:val="3"/>
         </w:numPr>
         <w:spacing w:after="60" w:line="276"/>
       </w:pPr>
@@ -44132,7 +46817,7 @@
         <w:pStyle w:val="ListParagraph"/>
         <w:numPr>
           <w:ilvl w:val="0"/>
-          <w:numId w:val="4"/>
+          <w:numId w:val="3"/>
         </w:numPr>
         <w:spacing w:after="60" w:line="276"/>
       </w:pPr>
@@ -44148,7 +46833,7 @@
         <w:pStyle w:val="ListParagraph"/>
         <w:numPr>
           <w:ilvl w:val="0"/>
-          <w:numId w:val="4"/>
+          <w:numId w:val="3"/>
         </w:numPr>
         <w:spacing w:after="60" w:line="276"/>
       </w:pPr>
@@ -45179,7 +47864,7 @@
               <w:rPr>
                 <w:rFonts w:ascii="Arial" w:cs="Arial" w:eastAsia="Arial" w:hAnsi="Arial"/>
               </w:rPr>
-              <w:t xml:space="preserve">QD-12</w:t>
+              <w:t xml:space="preserve">QD-12 – ĐÃ CHỐT</w:t>
             </w:r>
           </w:p>
         </w:tc>
@@ -45207,7 +47892,7 @@
               <w:rPr>
                 <w:rFonts w:ascii="Arial" w:cs="Arial" w:eastAsia="Arial" w:hAnsi="Arial"/>
               </w:rPr>
-              <w:t xml:space="preserve">Cho phép người dùng tự nhập key AI riêng trong app (BYOK)?</w:t>
+              <w:t xml:space="preserve">Tự nhập/đổi key AI trong app</w:t>
             </w:r>
           </w:p>
         </w:tc>
@@ -45235,7 +47920,7 @@
               <w:rPr>
                 <w:rFonts w:ascii="Arial" w:cs="Arial" w:eastAsia="Arial" w:hAnsi="Arial"/>
               </w:rPr>
-              <w:t xml:space="preserve">Không mặc định. Key do chủ app đặt ở máy chủ (Secrets). BYOK chỉ làm sau, nếu cần, lưu trên máy và cảnh báo rõ</w:t>
+              <w:t xml:space="preserve">Cho phép (chỉ một người dùng). Lưu mã hoá trên máy, khoá PIN tuỳ chọn, gọi thẳng từ trình duyệt; không đưa vào sao lưu/đồng bộ (AI-04)</w:t>
             </w:r>
           </w:p>
         </w:tc>
@@ -45265,7 +47950,7 @@
               <w:rPr>
                 <w:rFonts w:ascii="Arial" w:cs="Arial" w:eastAsia="Arial" w:hAnsi="Arial"/>
               </w:rPr>
-              <w:t xml:space="preserve">QD-13</w:t>
+              <w:t xml:space="preserve">QD-13 – ĐÃ CHỐT</w:t>
             </w:r>
           </w:p>
         </w:tc>
@@ -45293,7 +47978,7 @@
               <w:rPr>
                 <w:rFonts w:ascii="Arial" w:cs="Arial" w:eastAsia="Arial" w:hAnsi="Arial"/>
               </w:rPr>
-              <w:t xml:space="preserve">Nhà cung cấp AI dự phòng thứ hai sau Gemini?</w:t>
+              <w:t xml:space="preserve">Nguồn AI dự phòng</w:t>
             </w:r>
           </w:p>
         </w:tc>
@@ -45321,7 +48006,7 @@
               <w:rPr>
                 <w:rFonts w:ascii="Arial" w:cs="Arial" w:eastAsia="Arial" w:hAnsi="Arial"/>
               </w:rPr>
-              <w:t xml:space="preserve">Claude (Anthropic) cho đọc bảng/trích xuất cần chính xác; OpenRouter miễn phí chỉ để thử</w:t>
+              <w:t xml:space="preserve">Lovable → Claude (key riêng, trả phí; Haiku ≈ 15 đ/trang, Opus ≈ 500 đ/trang; fallbacks khi bị từ chối) → Mistral (Experiment miễn phí) → Gemini (miễn phí, đề xuất thêm) → trên máy. Giấy tờ nhạy cảm chỉ dùng Lovable/Claude (AI-05)</w:t>
             </w:r>
           </w:p>
         </w:tc>
@@ -45437,7 +48122,7 @@
         <w:rPr>
           <w:rFonts w:ascii="Arial" w:cs="Arial" w:eastAsia="Arial" w:hAnsi="Arial"/>
         </w:rPr>
-        <w:t xml:space="preserve">Duyệt báo cáo này và trả lời QD-1…QD-13 (QD-10, QD-11 đã chốt) (có thể trả lời ngắn, ví dụ “QD-1 theo khuyến nghị”).</w:t>
+        <w:t xml:space="preserve">Duyệt báo cáo này và trả lời QD-1…QD-9 (QD-10…QD-13 đã chốt) (có thể trả lời ngắn, ví dụ “QD-1 theo khuyến nghị”).</w:t>
       </w:r>
     </w:p>
     <w:p>
@@ -45470,6 +48155,22 @@
           <w:rFonts w:ascii="Arial" w:cs="Arial" w:eastAsia="Arial" w:hAnsi="Arial"/>
         </w:rPr>
         <w:t xml:space="preserve">Sau Đợt 1 và Đợt 2: thử trên điện thoại thật theo phiếu CS-14 (chụp 10 trang, bấm Xong, xem lại, xuất PDF), ghi lại thời gian chờ và lỗi gặp phải.</w:t>
+      </w:r>
+    </w:p>
+    <w:p>
+      <w:pPr>
+        <w:pStyle w:val="ListParagraph"/>
+        <w:numPr>
+          <w:ilvl w:val="0"/>
+          <w:numId w:val="6"/>
+        </w:numPr>
+        <w:spacing w:after="60" w:line="276"/>
+      </w:pPr>
+      <w:r>
+        <w:rPr>
+          <w:rFonts w:ascii="Arial" w:cs="Arial" w:eastAsia="Arial" w:hAnsi="Arial"/>
+        </w:rPr>
+        <w:t xml:space="preserve">Tạo key Claude (nạp credit, đặt hạn mức tháng) và key Mistral theo bảng 12.4 để dán vào app khi AI-04 xong.</w:t>
       </w:r>
     </w:p>
     <w:p>
@@ -48798,13 +51499,13 @@
     </w:lvlOverride>
   </w:num>
   <w:num w:numId="3">
-    <w:abstractNumId w:val="3"/>
+    <w:abstractNumId w:val="2"/>
     <w:lvlOverride w:ilvl="0">
       <w:startOverride w:val="1"/>
     </w:lvlOverride>
   </w:num>
   <w:num w:numId="4">
-    <w:abstractNumId w:val="2"/>
+    <w:abstractNumId w:val="3"/>
     <w:lvlOverride w:ilvl="0">
       <w:startOverride w:val="1"/>
     </w:lvlOverride>

</xml_diff>